<commit_message>
Etapa 1 Completa: logica, BJT, calculos, pruebas, diagramas e informe final
</commit_message>
<xml_diff>
--- a/05_Informe/EIC901 - Etapa 1 - Extinción por votación 2 de 3 - V3.docx
+++ b/05_Informe/EIC901 - Etapa 1 - Extinción por votación 2 de 3 - V3.docx
@@ -419,7 +419,21 @@
           <w:szCs w:val="24"/>
           <w:rtl w:val="0"/>
         </w:rPr>
-        <w:t xml:space="preserve">1. ________________________________________________</w:t>
+        <w:t xml:space="preserve">1. </w:t>
+      </w:r>
+      <w:r>
+        <w:rPr>
+          <w:rFonts w:ascii="Times New Roman" w:cs="Times New Roman" w:eastAsia="Times New Roman" w:hAnsi="Times New Roman"/>
+          <w:sz w:val="24"/>
+          <w:szCs w:val="24"/>
+          <w:rtl w:val="0"/>
+        </w:rPr>
+        <w:t xml:space="preserve">Cesar Ernesto Perdomo Guerrero PG241690</w:t>
+      </w:r>
+      <w:r>
+        <w:rPr>
+          <w:rtl w:val="0"/>
+        </w:rPr>
       </w:r>
     </w:p>
     <w:p>
@@ -8226,12 +8240,12 @@
                 <wp:inline distB="114300" distT="114300" distL="114300" distR="114300">
                   <wp:extent cx="8877300" cy="4064918"/>
                   <wp:effectExtent b="0" l="0" r="0" t="0"/>
-                  <wp:docPr id="8" name="image7.png"/>
+                  <wp:docPr id="8" name="image8.png"/>
                   <a:graphic>
                     <a:graphicData uri="http://schemas.openxmlformats.org/drawingml/2006/picture">
                       <pic:pic>
                         <pic:nvPicPr>
-                          <pic:cNvPr id="0" name="image7.png"/>
+                          <pic:cNvPr id="0" name="image8.png"/>
                           <pic:cNvPicPr preferRelativeResize="0"/>
                         </pic:nvPicPr>
                         <pic:blipFill>
@@ -8576,12 +8590,12 @@
                 <wp:inline distB="114300" distT="114300" distL="114300" distR="114300">
                   <wp:extent cx="5713627" cy="2209800"/>
                   <wp:effectExtent b="0" l="0" r="0" t="0"/>
-                  <wp:docPr id="1" name="image8.png"/>
+                  <wp:docPr id="1" name="image4.png"/>
                   <a:graphic>
                     <a:graphicData uri="http://schemas.openxmlformats.org/drawingml/2006/picture">
                       <pic:pic>
                         <pic:nvPicPr>
-                          <pic:cNvPr id="0" name="image8.png"/>
+                          <pic:cNvPr id="0" name="image4.png"/>
                           <pic:cNvPicPr preferRelativeResize="0"/>
                         </pic:nvPicPr>
                         <pic:blipFill>
@@ -8865,12 +8879,12 @@
                 <wp:inline distB="114300" distT="114300" distL="114300" distR="114300">
                   <wp:extent cx="5715000" cy="2246905"/>
                   <wp:effectExtent b="0" l="0" r="0" t="0"/>
-                  <wp:docPr id="2" name="image5.png"/>
+                  <wp:docPr id="2" name="image2.png"/>
                   <a:graphic>
                     <a:graphicData uri="http://schemas.openxmlformats.org/drawingml/2006/picture">
                       <pic:pic>
                         <pic:nvPicPr>
-                          <pic:cNvPr id="0" name="image5.png"/>
+                          <pic:cNvPr id="0" name="image2.png"/>
                           <pic:cNvPicPr preferRelativeResize="0"/>
                         </pic:nvPicPr>
                         <pic:blipFill>
@@ -9274,12 +9288,12 @@
                 <wp:inline distB="114300" distT="114300" distL="114300" distR="114300">
                   <wp:extent cx="5715000" cy="1955132"/>
                   <wp:effectExtent b="0" l="0" r="0" t="0"/>
-                  <wp:docPr id="3" name="image6.png"/>
+                  <wp:docPr id="3" name="image1.png"/>
                   <a:graphic>
                     <a:graphicData uri="http://schemas.openxmlformats.org/drawingml/2006/picture">
                       <pic:pic>
                         <pic:nvPicPr>
-                          <pic:cNvPr id="0" name="image6.png"/>
+                          <pic:cNvPr id="0" name="image1.png"/>
                           <pic:cNvPicPr preferRelativeResize="0"/>
                         </pic:nvPicPr>
                         <pic:blipFill>
@@ -9820,12 +9834,12 @@
                 <wp:inline distB="114300" distT="114300" distL="114300" distR="114300">
                   <wp:extent cx="5334000" cy="3718724"/>
                   <wp:effectExtent b="0" l="0" r="0" t="0"/>
-                  <wp:docPr id="5" name="image3.png"/>
+                  <wp:docPr id="5" name="image7.png"/>
                   <a:graphic>
                     <a:graphicData uri="http://schemas.openxmlformats.org/drawingml/2006/picture">
                       <pic:pic>
                         <pic:nvPicPr>
-                          <pic:cNvPr id="0" name="image3.png"/>
+                          <pic:cNvPr id="0" name="image7.png"/>
                           <pic:cNvPicPr preferRelativeResize="0"/>
                         </pic:nvPicPr>
                         <pic:blipFill>
@@ -10043,42 +10057,14 @@
     </w:p>
     <w:p>
       <w:pPr>
-        <w:keepNext w:val="0"/>
-        <w:keepLines w:val="0"/>
-        <w:pageBreakBefore w:val="0"/>
-        <w:widowControl w:val="0"/>
-        <w:pBdr>
-          <w:top w:space="0" w:sz="0" w:val="nil"/>
-          <w:left w:space="0" w:sz="0" w:val="nil"/>
-          <w:bottom w:space="0" w:sz="0" w:val="nil"/>
-          <w:right w:space="0" w:sz="0" w:val="nil"/>
-          <w:between w:space="0" w:sz="0" w:val="nil"/>
-        </w:pBdr>
-        <w:shd w:fill="auto" w:val="clear"/>
-        <w:spacing w:after="120" w:before="0" w:line="360" w:lineRule="auto"/>
-        <w:ind w:left="0" w:right="0" w:firstLine="0"/>
-        <w:jc w:val="both"/>
-        <w:rPr>
-          <w:rFonts w:ascii="Times New Roman" w:cs="Times New Roman" w:eastAsia="Times New Roman" w:hAnsi="Times New Roman"/>
-          <w:i w:val="0"/>
-          <w:iCs w:val="0"/>
-          <w:sz w:val="24"/>
-          <w:szCs w:val="24"/>
-        </w:rPr>
-      </w:pPr>
-      <w:r>
-        <w:rPr>
-          <w:rFonts w:ascii="Cardo" w:cs="Cardo" w:eastAsia="Cardo" w:hAnsi="Cardo"/>
-          <w:sz w:val="24"/>
-          <w:szCs w:val="24"/>
-          <w:rtl w:val="0"/>
-        </w:rPr>
-        <w:t xml:space="preserve">En la simulación se utilizó una alimentación lógica de 5,0 V y una resistencia de base RB = 1 kΩ. Tomando como aproximación VBE ≈ 0,7 V para un transistor de silicio, la corriente de base resulta IB = (5,0 V − 0,7 V) / 1000 Ω ≈ 4,3 mA. La corriente del motor no fue medida durante esta simulación; para una implementación física deberá verificarse la corriente real del actuador y comprobar que el transistor seleccionado pueda manejarla con margen suficiente.</w:t>
-      </w:r>
-      <w:r>
-        <w:rPr>
-          <w:rtl w:val="0"/>
-        </w:rPr>
+        <w:rPr/>
+      </w:pPr>
+      <w:r>
+        <w:rPr>
+          <w:rFonts w:ascii="Arial Unicode MS" w:cs="Arial Unicode MS" w:eastAsia="Arial Unicode MS" w:hAnsi="Arial Unicode MS"/>
+          <w:rtl w:val="0"/>
+        </w:rPr>
+        <w:t xml:space="preserve">En la simulación se utilizó una alimentación lógica de 5,0 V y una resistencia de base RB = 1 kΩ. Tomando como aproximación VBE ≈ 0,7 V para un transistor de silicio, la corriente de base resulta IB = (5,0 V − 0,7 V) / 1000 Ω ≈ 4,3 mA. Para completar el dimensionamiento de la etapa de interfaz, se midió la corriente del motor con el multímetro conectado en serie y la salida F = 1, obteniéndose IC ≈ 79,3 mA. También se midieron aproximadamente 4,70 V sobre la carga. Con estos valores, la relación IC/IB es aproximadamente 18,4 y la potencia eléctrica consumida por el motor es P ≈ V × I = 4,70 V × 0,0793 A ≈ 0,37 W. Estas mediciones corresponden al motor utilizado como representación del actuador en Tinkercad; en una implementación física deberá verificarse la corriente real de la electroválvula y seleccionarse el transistor con el margen adecuado.</w:t>
       </w:r>
     </w:p>
     <w:p>
@@ -11331,7 +11317,7 @@
                 <w:szCs w:val="20"/>
                 <w:rtl w:val="0"/>
               </w:rPr>
-              <w:t xml:space="preserve">N/D</w:t>
+              <w:t xml:space="preserve">79,3</w:t>
             </w:r>
           </w:p>
         </w:tc>
@@ -11718,12 +11704,12 @@
                 <wp:inline distB="114300" distT="114300" distL="114300" distR="114300">
                   <wp:extent cx="5078745" cy="4508500"/>
                   <wp:effectExtent b="0" l="0" r="0" t="0"/>
-                  <wp:docPr id="6" name="image1.png"/>
+                  <wp:docPr id="6" name="image5.png"/>
                   <a:graphic>
                     <a:graphicData uri="http://schemas.openxmlformats.org/drawingml/2006/picture">
                       <pic:pic>
                         <pic:nvPicPr>
-                          <pic:cNvPr id="0" name="image1.png"/>
+                          <pic:cNvPr id="0" name="image5.png"/>
                           <pic:cNvPicPr preferRelativeResize="0"/>
                         </pic:nvPicPr>
                         <pic:blipFill>
@@ -15440,12 +15426,12 @@
                 <wp:inline distB="114300" distT="114300" distL="114300" distR="114300">
                   <wp:extent cx="5706094" cy="2362200"/>
                   <wp:effectExtent b="0" l="0" r="0" t="0"/>
-                  <wp:docPr id="7" name="image2.png"/>
+                  <wp:docPr id="7" name="image3.png"/>
                   <a:graphic>
                     <a:graphicData uri="http://schemas.openxmlformats.org/drawingml/2006/picture">
                       <pic:pic>
                         <pic:nvPicPr>
-                          <pic:cNvPr id="0" name="image2.png"/>
+                          <pic:cNvPr id="0" name="image3.png"/>
                           <pic:cNvPicPr preferRelativeResize="0"/>
                         </pic:nvPicPr>
                         <pic:blipFill>
@@ -15844,12 +15830,12 @@
                 <wp:inline distB="114300" distT="114300" distL="114300" distR="114300">
                   <wp:extent cx="5715000" cy="2231199"/>
                   <wp:effectExtent b="0" l="0" r="0" t="0"/>
-                  <wp:docPr id="4" name="image4.png"/>
+                  <wp:docPr id="4" name="image6.png"/>
                   <a:graphic>
                     <a:graphicData uri="http://schemas.openxmlformats.org/drawingml/2006/picture">
                       <pic:pic>
                         <pic:nvPicPr>
-                          <pic:cNvPr id="0" name="image4.png"/>
+                          <pic:cNvPr id="0" name="image6.png"/>
                           <pic:cNvPicPr preferRelativeResize="0"/>
                         </pic:nvPicPr>
                         <pic:blipFill>
@@ -16452,22 +16438,25 @@
         <w:jc w:val="both"/>
         <w:rPr>
           <w:rFonts w:ascii="Times New Roman" w:cs="Times New Roman" w:eastAsia="Times New Roman" w:hAnsi="Times New Roman"/>
+          <w:sz w:val="24"/>
+          <w:szCs w:val="24"/>
+        </w:rPr>
+      </w:pPr>
+      <w:r>
+        <w:rPr>
+          <w:rFonts w:ascii="Times New Roman" w:cs="Times New Roman" w:eastAsia="Times New Roman" w:hAnsi="Times New Roman"/>
           <w:i w:val="0"/>
           <w:iCs w:val="0"/>
           <w:sz w:val="24"/>
           <w:szCs w:val="24"/>
-        </w:rPr>
-      </w:pPr>
-      <w:r>
-        <w:rPr>
-          <w:rFonts w:ascii="Times New Roman" w:cs="Times New Roman" w:eastAsia="Times New Roman" w:hAnsi="Times New Roman"/>
-          <w:i w:val="0"/>
-          <w:iCs w:val="0"/>
-          <w:sz w:val="24"/>
-          <w:szCs w:val="24"/>
-          <w:rtl w:val="0"/>
-        </w:rPr>
-        <w:t xml:space="preserve">Ruta de Aprendizaje EIC901, Ciclo 02-2026.</w:t>
+          <w:rtl w:val="0"/>
+        </w:rPr>
+        <w:t xml:space="preserve">Ruta de Aprendizaje EIC901</w:t>
+      </w:r>
+      <w:r>
+        <w:rPr>
+          <w:rtl w:val="0"/>
+        </w:rPr>
       </w:r>
     </w:p>
     <w:p>

</xml_diff>

<commit_message>
Actualiza informe final de la Etapa 1
</commit_message>
<xml_diff>
--- a/05_Informe/EIC901 - Etapa 1 - Extinción por votación 2 de 3 - V3.docx
+++ b/05_Informe/EIC901 - Etapa 1 - Extinción por votación 2 de 3 - V3.docx
@@ -8429,6 +8429,18 @@
     </w:p>
     <w:p>
       <w:pPr>
+        <w:spacing w:before="200" w:lineRule="auto"/>
+        <w:rPr/>
+      </w:pPr>
+      <w:r>
+        <w:rPr>
+          <w:rtl w:val="0"/>
+        </w:rPr>
+        <w:t xml:space="preserve">Para facilitar la identificación visual de las conexiones durante la simulación, se utilizó un código de colores consistente en todo el circuito.</w:t>
+      </w:r>
+    </w:p>
+    <w:p>
+      <w:pPr>
         <w:pStyle w:val="Heading2"/>
         <w:spacing w:before="200" w:lineRule="auto"/>
         <w:rPr>
@@ -8437,8 +8449,925 @@
           <w:szCs w:val="24"/>
         </w:rPr>
       </w:pPr>
-      <w:bookmarkStart w:colFirst="0" w:colLast="0" w:name="_bpbxepq63i9g" w:id="22"/>
+      <w:bookmarkStart w:colFirst="0" w:colLast="0" w:name="_e6syun3b5p2w" w:id="22"/>
       <w:bookmarkEnd w:id="22"/>
+      <w:r>
+        <w:rPr>
+          <w:rtl w:val="0"/>
+        </w:rPr>
+      </w:r>
+    </w:p>
+    <w:tbl>
+      <w:tblPr>
+        <w:tblStyle w:val="Table6"/>
+        <w:tblW w:w="9029.0" w:type="dxa"/>
+        <w:jc w:val="left"/>
+        <w:tblBorders>
+          <w:top w:color="000000" w:space="0" w:sz="8" w:val="single"/>
+          <w:left w:color="000000" w:space="0" w:sz="8" w:val="single"/>
+          <w:bottom w:color="000000" w:space="0" w:sz="8" w:val="single"/>
+          <w:right w:color="000000" w:space="0" w:sz="8" w:val="single"/>
+          <w:insideH w:color="000000" w:space="0" w:sz="8" w:val="single"/>
+          <w:insideV w:color="000000" w:space="0" w:sz="8" w:val="single"/>
+        </w:tblBorders>
+        <w:tblLayout w:type="fixed"/>
+        <w:tblLook w:val="0600"/>
+      </w:tblPr>
+      <w:tblGrid>
+        <w:gridCol w:w="4514.5"/>
+        <w:gridCol w:w="4514.5"/>
+        <w:tblGridChange w:id="0">
+          <w:tblGrid>
+            <w:gridCol w:w="4514.5"/>
+            <w:gridCol w:w="4514.5"/>
+          </w:tblGrid>
+        </w:tblGridChange>
+      </w:tblGrid>
+      <w:tr>
+        <w:trPr>
+          <w:cantSplit w:val="0"/>
+          <w:tblHeader w:val="0"/>
+        </w:trPr>
+        <w:tc>
+          <w:tcPr>
+            <w:shd w:fill="auto" w:val="clear"/>
+            <w:tcMar>
+              <w:top w:w="100.0" w:type="dxa"/>
+              <w:left w:w="100.0" w:type="dxa"/>
+              <w:bottom w:w="100.0" w:type="dxa"/>
+              <w:right w:w="100.0" w:type="dxa"/>
+            </w:tcMar>
+            <w:vAlign w:val="top"/>
+          </w:tcPr>
+          <w:p>
+            <w:pPr>
+              <w:keepNext w:val="0"/>
+              <w:keepLines w:val="0"/>
+              <w:pageBreakBefore w:val="0"/>
+              <w:widowControl w:val="0"/>
+              <w:pBdr>
+                <w:top w:space="0" w:sz="0" w:val="nil"/>
+                <w:left w:space="0" w:sz="0" w:val="nil"/>
+                <w:bottom w:space="0" w:sz="0" w:val="nil"/>
+                <w:right w:space="0" w:sz="0" w:val="nil"/>
+                <w:between w:space="0" w:sz="0" w:val="nil"/>
+              </w:pBdr>
+              <w:shd w:fill="auto" w:val="clear"/>
+              <w:spacing w:after="0" w:before="0" w:line="240" w:lineRule="auto"/>
+              <w:ind w:left="0" w:right="0" w:firstLine="0"/>
+              <w:jc w:val="left"/>
+              <w:rPr>
+                <w:rFonts w:ascii="Times New Roman" w:cs="Times New Roman" w:eastAsia="Times New Roman" w:hAnsi="Times New Roman"/>
+                <w:b w:val="1"/>
+                <w:bCs w:val="1"/>
+                <w:sz w:val="24"/>
+                <w:szCs w:val="24"/>
+              </w:rPr>
+            </w:pPr>
+            <w:r>
+              <w:rPr>
+                <w:rFonts w:ascii="Times New Roman" w:cs="Times New Roman" w:eastAsia="Times New Roman" w:hAnsi="Times New Roman"/>
+                <w:b w:val="1"/>
+                <w:bCs w:val="1"/>
+                <w:sz w:val="24"/>
+                <w:szCs w:val="24"/>
+                <w:rtl w:val="0"/>
+              </w:rPr>
+              <w:t xml:space="preserve">Color</w:t>
+            </w:r>
+          </w:p>
+        </w:tc>
+        <w:tc>
+          <w:tcPr>
+            <w:shd w:fill="auto" w:val="clear"/>
+            <w:tcMar>
+              <w:top w:w="100.0" w:type="dxa"/>
+              <w:left w:w="100.0" w:type="dxa"/>
+              <w:bottom w:w="100.0" w:type="dxa"/>
+              <w:right w:w="100.0" w:type="dxa"/>
+            </w:tcMar>
+            <w:vAlign w:val="top"/>
+          </w:tcPr>
+          <w:p>
+            <w:pPr>
+              <w:keepNext w:val="0"/>
+              <w:keepLines w:val="0"/>
+              <w:pageBreakBefore w:val="0"/>
+              <w:widowControl w:val="0"/>
+              <w:pBdr>
+                <w:top w:space="0" w:sz="0" w:val="nil"/>
+                <w:left w:space="0" w:sz="0" w:val="nil"/>
+                <w:bottom w:space="0" w:sz="0" w:val="nil"/>
+                <w:right w:space="0" w:sz="0" w:val="nil"/>
+                <w:between w:space="0" w:sz="0" w:val="nil"/>
+              </w:pBdr>
+              <w:shd w:fill="auto" w:val="clear"/>
+              <w:spacing w:after="0" w:before="0" w:line="240" w:lineRule="auto"/>
+              <w:ind w:left="0" w:right="0" w:firstLine="0"/>
+              <w:jc w:val="left"/>
+              <w:rPr>
+                <w:rFonts w:ascii="Times New Roman" w:cs="Times New Roman" w:eastAsia="Times New Roman" w:hAnsi="Times New Roman"/>
+                <w:b w:val="1"/>
+                <w:bCs w:val="1"/>
+                <w:sz w:val="24"/>
+                <w:szCs w:val="24"/>
+              </w:rPr>
+            </w:pPr>
+            <w:r>
+              <w:rPr>
+                <w:rFonts w:ascii="Times New Roman" w:cs="Times New Roman" w:eastAsia="Times New Roman" w:hAnsi="Times New Roman"/>
+                <w:b w:val="1"/>
+                <w:bCs w:val="1"/>
+                <w:sz w:val="24"/>
+                <w:szCs w:val="24"/>
+                <w:rtl w:val="0"/>
+              </w:rPr>
+              <w:t xml:space="preserve">Uso</w:t>
+            </w:r>
+          </w:p>
+        </w:tc>
+      </w:tr>
+      <w:tr>
+        <w:trPr>
+          <w:cantSplit w:val="0"/>
+          <w:tblHeader w:val="0"/>
+        </w:trPr>
+        <w:tc>
+          <w:tcPr>
+            <w:shd w:fill="auto" w:val="clear"/>
+            <w:tcMar>
+              <w:top w:w="100.0" w:type="dxa"/>
+              <w:left w:w="100.0" w:type="dxa"/>
+              <w:bottom w:w="100.0" w:type="dxa"/>
+              <w:right w:w="100.0" w:type="dxa"/>
+            </w:tcMar>
+            <w:vAlign w:val="top"/>
+          </w:tcPr>
+          <w:p>
+            <w:pPr>
+              <w:keepNext w:val="0"/>
+              <w:keepLines w:val="0"/>
+              <w:pageBreakBefore w:val="0"/>
+              <w:widowControl w:val="0"/>
+              <w:pBdr>
+                <w:top w:space="0" w:sz="0" w:val="nil"/>
+                <w:left w:space="0" w:sz="0" w:val="nil"/>
+                <w:bottom w:space="0" w:sz="0" w:val="nil"/>
+                <w:right w:space="0" w:sz="0" w:val="nil"/>
+                <w:between w:space="0" w:sz="0" w:val="nil"/>
+              </w:pBdr>
+              <w:shd w:fill="auto" w:val="clear"/>
+              <w:spacing w:after="0" w:before="0" w:line="240" w:lineRule="auto"/>
+              <w:ind w:left="0" w:right="0" w:firstLine="0"/>
+              <w:jc w:val="left"/>
+              <w:rPr>
+                <w:rFonts w:ascii="Times New Roman" w:cs="Times New Roman" w:eastAsia="Times New Roman" w:hAnsi="Times New Roman"/>
+                <w:sz w:val="24"/>
+                <w:szCs w:val="24"/>
+              </w:rPr>
+            </w:pPr>
+            <w:r>
+              <w:rPr>
+                <w:rFonts w:ascii="Times New Roman" w:cs="Times New Roman" w:eastAsia="Times New Roman" w:hAnsi="Times New Roman"/>
+                <w:sz w:val="24"/>
+                <w:szCs w:val="24"/>
+                <w:rtl w:val="0"/>
+              </w:rPr>
+              <w:t xml:space="preserve">Rojo</w:t>
+            </w:r>
+          </w:p>
+        </w:tc>
+        <w:tc>
+          <w:tcPr>
+            <w:shd w:fill="auto" w:val="clear"/>
+            <w:tcMar>
+              <w:top w:w="100.0" w:type="dxa"/>
+              <w:left w:w="100.0" w:type="dxa"/>
+              <w:bottom w:w="100.0" w:type="dxa"/>
+              <w:right w:w="100.0" w:type="dxa"/>
+            </w:tcMar>
+            <w:vAlign w:val="top"/>
+          </w:tcPr>
+          <w:p>
+            <w:pPr>
+              <w:keepNext w:val="0"/>
+              <w:keepLines w:val="0"/>
+              <w:pageBreakBefore w:val="0"/>
+              <w:widowControl w:val="0"/>
+              <w:pBdr>
+                <w:top w:space="0" w:sz="0" w:val="nil"/>
+                <w:left w:space="0" w:sz="0" w:val="nil"/>
+                <w:bottom w:space="0" w:sz="0" w:val="nil"/>
+                <w:right w:space="0" w:sz="0" w:val="nil"/>
+                <w:between w:space="0" w:sz="0" w:val="nil"/>
+              </w:pBdr>
+              <w:shd w:fill="auto" w:val="clear"/>
+              <w:spacing w:after="0" w:before="0" w:line="240" w:lineRule="auto"/>
+              <w:ind w:left="0" w:right="0" w:firstLine="0"/>
+              <w:jc w:val="left"/>
+              <w:rPr>
+                <w:rFonts w:ascii="Times New Roman" w:cs="Times New Roman" w:eastAsia="Times New Roman" w:hAnsi="Times New Roman"/>
+                <w:sz w:val="24"/>
+                <w:szCs w:val="24"/>
+              </w:rPr>
+            </w:pPr>
+            <w:r>
+              <w:rPr>
+                <w:rFonts w:ascii="Times New Roman" w:cs="Times New Roman" w:eastAsia="Times New Roman" w:hAnsi="Times New Roman"/>
+                <w:sz w:val="24"/>
+                <w:szCs w:val="24"/>
+                <w:rtl w:val="0"/>
+              </w:rPr>
+              <w:t xml:space="preserve">Alimentación +5 V</w:t>
+            </w:r>
+          </w:p>
+        </w:tc>
+      </w:tr>
+      <w:tr>
+        <w:trPr>
+          <w:cantSplit w:val="0"/>
+          <w:tblHeader w:val="0"/>
+        </w:trPr>
+        <w:tc>
+          <w:tcPr>
+            <w:shd w:fill="auto" w:val="clear"/>
+            <w:tcMar>
+              <w:top w:w="100.0" w:type="dxa"/>
+              <w:left w:w="100.0" w:type="dxa"/>
+              <w:bottom w:w="100.0" w:type="dxa"/>
+              <w:right w:w="100.0" w:type="dxa"/>
+            </w:tcMar>
+            <w:vAlign w:val="top"/>
+          </w:tcPr>
+          <w:p>
+            <w:pPr>
+              <w:keepNext w:val="0"/>
+              <w:keepLines w:val="0"/>
+              <w:pageBreakBefore w:val="0"/>
+              <w:widowControl w:val="0"/>
+              <w:pBdr>
+                <w:top w:space="0" w:sz="0" w:val="nil"/>
+                <w:left w:space="0" w:sz="0" w:val="nil"/>
+                <w:bottom w:space="0" w:sz="0" w:val="nil"/>
+                <w:right w:space="0" w:sz="0" w:val="nil"/>
+                <w:between w:space="0" w:sz="0" w:val="nil"/>
+              </w:pBdr>
+              <w:shd w:fill="auto" w:val="clear"/>
+              <w:spacing w:after="0" w:before="0" w:line="240" w:lineRule="auto"/>
+              <w:ind w:left="0" w:right="0" w:firstLine="0"/>
+              <w:jc w:val="left"/>
+              <w:rPr>
+                <w:rFonts w:ascii="Times New Roman" w:cs="Times New Roman" w:eastAsia="Times New Roman" w:hAnsi="Times New Roman"/>
+                <w:sz w:val="24"/>
+                <w:szCs w:val="24"/>
+              </w:rPr>
+            </w:pPr>
+            <w:r>
+              <w:rPr>
+                <w:rFonts w:ascii="Times New Roman" w:cs="Times New Roman" w:eastAsia="Times New Roman" w:hAnsi="Times New Roman"/>
+                <w:sz w:val="24"/>
+                <w:szCs w:val="24"/>
+                <w:rtl w:val="0"/>
+              </w:rPr>
+              <w:t xml:space="preserve">Negro</w:t>
+            </w:r>
+          </w:p>
+        </w:tc>
+        <w:tc>
+          <w:tcPr>
+            <w:shd w:fill="auto" w:val="clear"/>
+            <w:tcMar>
+              <w:top w:w="100.0" w:type="dxa"/>
+              <w:left w:w="100.0" w:type="dxa"/>
+              <w:bottom w:w="100.0" w:type="dxa"/>
+              <w:right w:w="100.0" w:type="dxa"/>
+            </w:tcMar>
+            <w:vAlign w:val="top"/>
+          </w:tcPr>
+          <w:p>
+            <w:pPr>
+              <w:keepNext w:val="0"/>
+              <w:keepLines w:val="0"/>
+              <w:pageBreakBefore w:val="0"/>
+              <w:widowControl w:val="0"/>
+              <w:pBdr>
+                <w:top w:space="0" w:sz="0" w:val="nil"/>
+                <w:left w:space="0" w:sz="0" w:val="nil"/>
+                <w:bottom w:space="0" w:sz="0" w:val="nil"/>
+                <w:right w:space="0" w:sz="0" w:val="nil"/>
+                <w:between w:space="0" w:sz="0" w:val="nil"/>
+              </w:pBdr>
+              <w:shd w:fill="auto" w:val="clear"/>
+              <w:spacing w:after="0" w:before="0" w:line="240" w:lineRule="auto"/>
+              <w:ind w:left="0" w:right="0" w:firstLine="0"/>
+              <w:jc w:val="left"/>
+              <w:rPr>
+                <w:rFonts w:ascii="Times New Roman" w:cs="Times New Roman" w:eastAsia="Times New Roman" w:hAnsi="Times New Roman"/>
+                <w:sz w:val="24"/>
+                <w:szCs w:val="24"/>
+              </w:rPr>
+            </w:pPr>
+            <w:r>
+              <w:rPr>
+                <w:rFonts w:ascii="Times New Roman" w:cs="Times New Roman" w:eastAsia="Times New Roman" w:hAnsi="Times New Roman"/>
+                <w:sz w:val="24"/>
+                <w:szCs w:val="24"/>
+                <w:rtl w:val="0"/>
+              </w:rPr>
+              <w:t xml:space="preserve">GND</w:t>
+            </w:r>
+          </w:p>
+        </w:tc>
+      </w:tr>
+      <w:tr>
+        <w:trPr>
+          <w:cantSplit w:val="0"/>
+          <w:tblHeader w:val="0"/>
+        </w:trPr>
+        <w:tc>
+          <w:tcPr>
+            <w:shd w:fill="auto" w:val="clear"/>
+            <w:tcMar>
+              <w:top w:w="100.0" w:type="dxa"/>
+              <w:left w:w="100.0" w:type="dxa"/>
+              <w:bottom w:w="100.0" w:type="dxa"/>
+              <w:right w:w="100.0" w:type="dxa"/>
+            </w:tcMar>
+            <w:vAlign w:val="top"/>
+          </w:tcPr>
+          <w:p>
+            <w:pPr>
+              <w:keepNext w:val="0"/>
+              <w:keepLines w:val="0"/>
+              <w:pageBreakBefore w:val="0"/>
+              <w:widowControl w:val="0"/>
+              <w:pBdr>
+                <w:top w:space="0" w:sz="0" w:val="nil"/>
+                <w:left w:space="0" w:sz="0" w:val="nil"/>
+                <w:bottom w:space="0" w:sz="0" w:val="nil"/>
+                <w:right w:space="0" w:sz="0" w:val="nil"/>
+                <w:between w:space="0" w:sz="0" w:val="nil"/>
+              </w:pBdr>
+              <w:shd w:fill="auto" w:val="clear"/>
+              <w:spacing w:after="0" w:before="0" w:line="240" w:lineRule="auto"/>
+              <w:ind w:left="0" w:right="0" w:firstLine="0"/>
+              <w:jc w:val="left"/>
+              <w:rPr>
+                <w:rFonts w:ascii="Times New Roman" w:cs="Times New Roman" w:eastAsia="Times New Roman" w:hAnsi="Times New Roman"/>
+                <w:sz w:val="24"/>
+                <w:szCs w:val="24"/>
+              </w:rPr>
+            </w:pPr>
+            <w:r>
+              <w:rPr>
+                <w:rFonts w:ascii="Times New Roman" w:cs="Times New Roman" w:eastAsia="Times New Roman" w:hAnsi="Times New Roman"/>
+                <w:sz w:val="24"/>
+                <w:szCs w:val="24"/>
+                <w:rtl w:val="0"/>
+              </w:rPr>
+              <w:t xml:space="preserve">Amarillo</w:t>
+            </w:r>
+          </w:p>
+        </w:tc>
+        <w:tc>
+          <w:tcPr>
+            <w:shd w:fill="auto" w:val="clear"/>
+            <w:tcMar>
+              <w:top w:w="100.0" w:type="dxa"/>
+              <w:left w:w="100.0" w:type="dxa"/>
+              <w:bottom w:w="100.0" w:type="dxa"/>
+              <w:right w:w="100.0" w:type="dxa"/>
+            </w:tcMar>
+            <w:vAlign w:val="top"/>
+          </w:tcPr>
+          <w:p>
+            <w:pPr>
+              <w:keepNext w:val="0"/>
+              <w:keepLines w:val="0"/>
+              <w:pageBreakBefore w:val="0"/>
+              <w:widowControl w:val="0"/>
+              <w:pBdr>
+                <w:top w:space="0" w:sz="0" w:val="nil"/>
+                <w:left w:space="0" w:sz="0" w:val="nil"/>
+                <w:bottom w:space="0" w:sz="0" w:val="nil"/>
+                <w:right w:space="0" w:sz="0" w:val="nil"/>
+                <w:between w:space="0" w:sz="0" w:val="nil"/>
+              </w:pBdr>
+              <w:shd w:fill="auto" w:val="clear"/>
+              <w:spacing w:after="0" w:before="0" w:line="240" w:lineRule="auto"/>
+              <w:ind w:left="0" w:right="0" w:firstLine="0"/>
+              <w:jc w:val="left"/>
+              <w:rPr>
+                <w:rFonts w:ascii="Times New Roman" w:cs="Times New Roman" w:eastAsia="Times New Roman" w:hAnsi="Times New Roman"/>
+                <w:sz w:val="24"/>
+                <w:szCs w:val="24"/>
+              </w:rPr>
+            </w:pPr>
+            <w:r>
+              <w:rPr>
+                <w:rFonts w:ascii="Times New Roman" w:cs="Times New Roman" w:eastAsia="Times New Roman" w:hAnsi="Times New Roman"/>
+                <w:sz w:val="24"/>
+                <w:szCs w:val="24"/>
+                <w:rtl w:val="0"/>
+              </w:rPr>
+              <w:t xml:space="preserve">Entrada A</w:t>
+            </w:r>
+          </w:p>
+        </w:tc>
+      </w:tr>
+      <w:tr>
+        <w:trPr>
+          <w:cantSplit w:val="0"/>
+          <w:tblHeader w:val="0"/>
+        </w:trPr>
+        <w:tc>
+          <w:tcPr>
+            <w:shd w:fill="auto" w:val="clear"/>
+            <w:tcMar>
+              <w:top w:w="100.0" w:type="dxa"/>
+              <w:left w:w="100.0" w:type="dxa"/>
+              <w:bottom w:w="100.0" w:type="dxa"/>
+              <w:right w:w="100.0" w:type="dxa"/>
+            </w:tcMar>
+            <w:vAlign w:val="top"/>
+          </w:tcPr>
+          <w:p>
+            <w:pPr>
+              <w:keepNext w:val="0"/>
+              <w:keepLines w:val="0"/>
+              <w:pageBreakBefore w:val="0"/>
+              <w:widowControl w:val="0"/>
+              <w:pBdr>
+                <w:top w:space="0" w:sz="0" w:val="nil"/>
+                <w:left w:space="0" w:sz="0" w:val="nil"/>
+                <w:bottom w:space="0" w:sz="0" w:val="nil"/>
+                <w:right w:space="0" w:sz="0" w:val="nil"/>
+                <w:between w:space="0" w:sz="0" w:val="nil"/>
+              </w:pBdr>
+              <w:shd w:fill="auto" w:val="clear"/>
+              <w:spacing w:after="0" w:before="0" w:line="240" w:lineRule="auto"/>
+              <w:ind w:left="0" w:right="0" w:firstLine="0"/>
+              <w:jc w:val="left"/>
+              <w:rPr>
+                <w:rFonts w:ascii="Times New Roman" w:cs="Times New Roman" w:eastAsia="Times New Roman" w:hAnsi="Times New Roman"/>
+                <w:sz w:val="24"/>
+                <w:szCs w:val="24"/>
+              </w:rPr>
+            </w:pPr>
+            <w:r>
+              <w:rPr>
+                <w:rFonts w:ascii="Times New Roman" w:cs="Times New Roman" w:eastAsia="Times New Roman" w:hAnsi="Times New Roman"/>
+                <w:sz w:val="24"/>
+                <w:szCs w:val="24"/>
+                <w:rtl w:val="0"/>
+              </w:rPr>
+              <w:t xml:space="preserve">Verde</w:t>
+            </w:r>
+          </w:p>
+        </w:tc>
+        <w:tc>
+          <w:tcPr>
+            <w:shd w:fill="auto" w:val="clear"/>
+            <w:tcMar>
+              <w:top w:w="100.0" w:type="dxa"/>
+              <w:left w:w="100.0" w:type="dxa"/>
+              <w:bottom w:w="100.0" w:type="dxa"/>
+              <w:right w:w="100.0" w:type="dxa"/>
+            </w:tcMar>
+            <w:vAlign w:val="top"/>
+          </w:tcPr>
+          <w:p>
+            <w:pPr>
+              <w:keepNext w:val="0"/>
+              <w:keepLines w:val="0"/>
+              <w:pageBreakBefore w:val="0"/>
+              <w:widowControl w:val="0"/>
+              <w:pBdr>
+                <w:top w:space="0" w:sz="0" w:val="nil"/>
+                <w:left w:space="0" w:sz="0" w:val="nil"/>
+                <w:bottom w:space="0" w:sz="0" w:val="nil"/>
+                <w:right w:space="0" w:sz="0" w:val="nil"/>
+                <w:between w:space="0" w:sz="0" w:val="nil"/>
+              </w:pBdr>
+              <w:shd w:fill="auto" w:val="clear"/>
+              <w:spacing w:after="0" w:before="0" w:line="240" w:lineRule="auto"/>
+              <w:ind w:left="0" w:right="0" w:firstLine="0"/>
+              <w:jc w:val="left"/>
+              <w:rPr>
+                <w:rFonts w:ascii="Times New Roman" w:cs="Times New Roman" w:eastAsia="Times New Roman" w:hAnsi="Times New Roman"/>
+                <w:sz w:val="24"/>
+                <w:szCs w:val="24"/>
+              </w:rPr>
+            </w:pPr>
+            <w:r>
+              <w:rPr>
+                <w:rFonts w:ascii="Times New Roman" w:cs="Times New Roman" w:eastAsia="Times New Roman" w:hAnsi="Times New Roman"/>
+                <w:sz w:val="24"/>
+                <w:szCs w:val="24"/>
+                <w:rtl w:val="0"/>
+              </w:rPr>
+              <w:t xml:space="preserve">Entrada B</w:t>
+            </w:r>
+          </w:p>
+        </w:tc>
+      </w:tr>
+      <w:tr>
+        <w:trPr>
+          <w:cantSplit w:val="0"/>
+          <w:tblHeader w:val="0"/>
+        </w:trPr>
+        <w:tc>
+          <w:tcPr>
+            <w:shd w:fill="auto" w:val="clear"/>
+            <w:tcMar>
+              <w:top w:w="100.0" w:type="dxa"/>
+              <w:left w:w="100.0" w:type="dxa"/>
+              <w:bottom w:w="100.0" w:type="dxa"/>
+              <w:right w:w="100.0" w:type="dxa"/>
+            </w:tcMar>
+            <w:vAlign w:val="top"/>
+          </w:tcPr>
+          <w:p>
+            <w:pPr>
+              <w:keepNext w:val="0"/>
+              <w:keepLines w:val="0"/>
+              <w:pageBreakBefore w:val="0"/>
+              <w:widowControl w:val="0"/>
+              <w:pBdr>
+                <w:top w:space="0" w:sz="0" w:val="nil"/>
+                <w:left w:space="0" w:sz="0" w:val="nil"/>
+                <w:bottom w:space="0" w:sz="0" w:val="nil"/>
+                <w:right w:space="0" w:sz="0" w:val="nil"/>
+                <w:between w:space="0" w:sz="0" w:val="nil"/>
+              </w:pBdr>
+              <w:shd w:fill="auto" w:val="clear"/>
+              <w:spacing w:after="0" w:before="0" w:line="240" w:lineRule="auto"/>
+              <w:ind w:left="0" w:right="0" w:firstLine="0"/>
+              <w:jc w:val="left"/>
+              <w:rPr>
+                <w:rFonts w:ascii="Times New Roman" w:cs="Times New Roman" w:eastAsia="Times New Roman" w:hAnsi="Times New Roman"/>
+                <w:sz w:val="24"/>
+                <w:szCs w:val="24"/>
+              </w:rPr>
+            </w:pPr>
+            <w:r>
+              <w:rPr>
+                <w:rFonts w:ascii="Times New Roman" w:cs="Times New Roman" w:eastAsia="Times New Roman" w:hAnsi="Times New Roman"/>
+                <w:sz w:val="24"/>
+                <w:szCs w:val="24"/>
+                <w:rtl w:val="0"/>
+              </w:rPr>
+              <w:t xml:space="preserve">Azul</w:t>
+            </w:r>
+          </w:p>
+        </w:tc>
+        <w:tc>
+          <w:tcPr>
+            <w:shd w:fill="auto" w:val="clear"/>
+            <w:tcMar>
+              <w:top w:w="100.0" w:type="dxa"/>
+              <w:left w:w="100.0" w:type="dxa"/>
+              <w:bottom w:w="100.0" w:type="dxa"/>
+              <w:right w:w="100.0" w:type="dxa"/>
+            </w:tcMar>
+            <w:vAlign w:val="top"/>
+          </w:tcPr>
+          <w:p>
+            <w:pPr>
+              <w:keepNext w:val="0"/>
+              <w:keepLines w:val="0"/>
+              <w:pageBreakBefore w:val="0"/>
+              <w:widowControl w:val="0"/>
+              <w:pBdr>
+                <w:top w:space="0" w:sz="0" w:val="nil"/>
+                <w:left w:space="0" w:sz="0" w:val="nil"/>
+                <w:bottom w:space="0" w:sz="0" w:val="nil"/>
+                <w:right w:space="0" w:sz="0" w:val="nil"/>
+                <w:between w:space="0" w:sz="0" w:val="nil"/>
+              </w:pBdr>
+              <w:shd w:fill="auto" w:val="clear"/>
+              <w:spacing w:after="0" w:before="0" w:line="240" w:lineRule="auto"/>
+              <w:ind w:left="0" w:right="0" w:firstLine="0"/>
+              <w:jc w:val="left"/>
+              <w:rPr>
+                <w:rFonts w:ascii="Times New Roman" w:cs="Times New Roman" w:eastAsia="Times New Roman" w:hAnsi="Times New Roman"/>
+                <w:sz w:val="24"/>
+                <w:szCs w:val="24"/>
+              </w:rPr>
+            </w:pPr>
+            <w:r>
+              <w:rPr>
+                <w:rFonts w:ascii="Times New Roman" w:cs="Times New Roman" w:eastAsia="Times New Roman" w:hAnsi="Times New Roman"/>
+                <w:sz w:val="24"/>
+                <w:szCs w:val="24"/>
+                <w:rtl w:val="0"/>
+              </w:rPr>
+              <w:t xml:space="preserve">Entrada C</w:t>
+            </w:r>
+          </w:p>
+        </w:tc>
+      </w:tr>
+      <w:tr>
+        <w:trPr>
+          <w:cantSplit w:val="0"/>
+          <w:tblHeader w:val="0"/>
+        </w:trPr>
+        <w:tc>
+          <w:tcPr>
+            <w:shd w:fill="auto" w:val="clear"/>
+            <w:tcMar>
+              <w:top w:w="100.0" w:type="dxa"/>
+              <w:left w:w="100.0" w:type="dxa"/>
+              <w:bottom w:w="100.0" w:type="dxa"/>
+              <w:right w:w="100.0" w:type="dxa"/>
+            </w:tcMar>
+            <w:vAlign w:val="top"/>
+          </w:tcPr>
+          <w:p>
+            <w:pPr>
+              <w:keepNext w:val="0"/>
+              <w:keepLines w:val="0"/>
+              <w:pageBreakBefore w:val="0"/>
+              <w:widowControl w:val="0"/>
+              <w:pBdr>
+                <w:top w:space="0" w:sz="0" w:val="nil"/>
+                <w:left w:space="0" w:sz="0" w:val="nil"/>
+                <w:bottom w:space="0" w:sz="0" w:val="nil"/>
+                <w:right w:space="0" w:sz="0" w:val="nil"/>
+                <w:between w:space="0" w:sz="0" w:val="nil"/>
+              </w:pBdr>
+              <w:shd w:fill="auto" w:val="clear"/>
+              <w:spacing w:after="0" w:before="0" w:line="240" w:lineRule="auto"/>
+              <w:ind w:left="0" w:right="0" w:firstLine="0"/>
+              <w:jc w:val="left"/>
+              <w:rPr>
+                <w:rFonts w:ascii="Times New Roman" w:cs="Times New Roman" w:eastAsia="Times New Roman" w:hAnsi="Times New Roman"/>
+                <w:sz w:val="24"/>
+                <w:szCs w:val="24"/>
+              </w:rPr>
+            </w:pPr>
+            <w:r>
+              <w:rPr>
+                <w:rFonts w:ascii="Times New Roman" w:cs="Times New Roman" w:eastAsia="Times New Roman" w:hAnsi="Times New Roman"/>
+                <w:sz w:val="24"/>
+                <w:szCs w:val="24"/>
+                <w:rtl w:val="0"/>
+              </w:rPr>
+              <w:t xml:space="preserve">Morado</w:t>
+            </w:r>
+          </w:p>
+        </w:tc>
+        <w:tc>
+          <w:tcPr>
+            <w:shd w:fill="auto" w:val="clear"/>
+            <w:tcMar>
+              <w:top w:w="100.0" w:type="dxa"/>
+              <w:left w:w="100.0" w:type="dxa"/>
+              <w:bottom w:w="100.0" w:type="dxa"/>
+              <w:right w:w="100.0" w:type="dxa"/>
+            </w:tcMar>
+            <w:vAlign w:val="top"/>
+          </w:tcPr>
+          <w:p>
+            <w:pPr>
+              <w:keepNext w:val="0"/>
+              <w:keepLines w:val="0"/>
+              <w:pageBreakBefore w:val="0"/>
+              <w:widowControl w:val="0"/>
+              <w:pBdr>
+                <w:top w:space="0" w:sz="0" w:val="nil"/>
+                <w:left w:space="0" w:sz="0" w:val="nil"/>
+                <w:bottom w:space="0" w:sz="0" w:val="nil"/>
+                <w:right w:space="0" w:sz="0" w:val="nil"/>
+                <w:between w:space="0" w:sz="0" w:val="nil"/>
+              </w:pBdr>
+              <w:shd w:fill="auto" w:val="clear"/>
+              <w:spacing w:after="0" w:before="0" w:line="240" w:lineRule="auto"/>
+              <w:ind w:left="0" w:right="0" w:firstLine="0"/>
+              <w:jc w:val="left"/>
+              <w:rPr>
+                <w:rFonts w:ascii="Times New Roman" w:cs="Times New Roman" w:eastAsia="Times New Roman" w:hAnsi="Times New Roman"/>
+                <w:sz w:val="24"/>
+                <w:szCs w:val="24"/>
+              </w:rPr>
+            </w:pPr>
+            <w:r>
+              <w:rPr>
+                <w:rFonts w:ascii="Times New Roman" w:cs="Times New Roman" w:eastAsia="Times New Roman" w:hAnsi="Times New Roman"/>
+                <w:sz w:val="24"/>
+                <w:szCs w:val="24"/>
+                <w:rtl w:val="0"/>
+              </w:rPr>
+              <w:t xml:space="preserve">Señales lógicas internas</w:t>
+            </w:r>
+          </w:p>
+        </w:tc>
+      </w:tr>
+      <w:tr>
+        <w:trPr>
+          <w:cantSplit w:val="0"/>
+          <w:tblHeader w:val="0"/>
+        </w:trPr>
+        <w:tc>
+          <w:tcPr>
+            <w:shd w:fill="auto" w:val="clear"/>
+            <w:tcMar>
+              <w:top w:w="100.0" w:type="dxa"/>
+              <w:left w:w="100.0" w:type="dxa"/>
+              <w:bottom w:w="100.0" w:type="dxa"/>
+              <w:right w:w="100.0" w:type="dxa"/>
+            </w:tcMar>
+            <w:vAlign w:val="top"/>
+          </w:tcPr>
+          <w:p>
+            <w:pPr>
+              <w:keepNext w:val="0"/>
+              <w:keepLines w:val="0"/>
+              <w:pageBreakBefore w:val="0"/>
+              <w:widowControl w:val="0"/>
+              <w:pBdr>
+                <w:top w:space="0" w:sz="0" w:val="nil"/>
+                <w:left w:space="0" w:sz="0" w:val="nil"/>
+                <w:bottom w:space="0" w:sz="0" w:val="nil"/>
+                <w:right w:space="0" w:sz="0" w:val="nil"/>
+                <w:between w:space="0" w:sz="0" w:val="nil"/>
+              </w:pBdr>
+              <w:shd w:fill="auto" w:val="clear"/>
+              <w:spacing w:after="0" w:before="0" w:line="240" w:lineRule="auto"/>
+              <w:ind w:left="0" w:right="0" w:firstLine="0"/>
+              <w:jc w:val="left"/>
+              <w:rPr>
+                <w:rFonts w:ascii="Times New Roman" w:cs="Times New Roman" w:eastAsia="Times New Roman" w:hAnsi="Times New Roman"/>
+                <w:sz w:val="24"/>
+                <w:szCs w:val="24"/>
+              </w:rPr>
+            </w:pPr>
+            <w:r>
+              <w:rPr>
+                <w:rFonts w:ascii="Times New Roman" w:cs="Times New Roman" w:eastAsia="Times New Roman" w:hAnsi="Times New Roman"/>
+                <w:sz w:val="24"/>
+                <w:szCs w:val="24"/>
+                <w:rtl w:val="0"/>
+              </w:rPr>
+              <w:t xml:space="preserve">Naranja</w:t>
+            </w:r>
+          </w:p>
+        </w:tc>
+        <w:tc>
+          <w:tcPr>
+            <w:shd w:fill="auto" w:val="clear"/>
+            <w:tcMar>
+              <w:top w:w="100.0" w:type="dxa"/>
+              <w:left w:w="100.0" w:type="dxa"/>
+              <w:bottom w:w="100.0" w:type="dxa"/>
+              <w:right w:w="100.0" w:type="dxa"/>
+            </w:tcMar>
+            <w:vAlign w:val="top"/>
+          </w:tcPr>
+          <w:p>
+            <w:pPr>
+              <w:keepNext w:val="0"/>
+              <w:keepLines w:val="0"/>
+              <w:pageBreakBefore w:val="0"/>
+              <w:widowControl w:val="0"/>
+              <w:pBdr>
+                <w:top w:space="0" w:sz="0" w:val="nil"/>
+                <w:left w:space="0" w:sz="0" w:val="nil"/>
+                <w:bottom w:space="0" w:sz="0" w:val="nil"/>
+                <w:right w:space="0" w:sz="0" w:val="nil"/>
+                <w:between w:space="0" w:sz="0" w:val="nil"/>
+              </w:pBdr>
+              <w:shd w:fill="auto" w:val="clear"/>
+              <w:spacing w:after="0" w:before="0" w:line="240" w:lineRule="auto"/>
+              <w:ind w:left="0" w:right="0" w:firstLine="0"/>
+              <w:jc w:val="left"/>
+              <w:rPr>
+                <w:rFonts w:ascii="Times New Roman" w:cs="Times New Roman" w:eastAsia="Times New Roman" w:hAnsi="Times New Roman"/>
+                <w:sz w:val="24"/>
+                <w:szCs w:val="24"/>
+              </w:rPr>
+            </w:pPr>
+            <w:r>
+              <w:rPr>
+                <w:rFonts w:ascii="Times New Roman" w:cs="Times New Roman" w:eastAsia="Times New Roman" w:hAnsi="Times New Roman"/>
+                <w:sz w:val="24"/>
+                <w:szCs w:val="24"/>
+                <w:rtl w:val="0"/>
+              </w:rPr>
+              <w:t xml:space="preserve">Salida F</w:t>
+            </w:r>
+          </w:p>
+        </w:tc>
+      </w:tr>
+      <w:tr>
+        <w:trPr>
+          <w:cantSplit w:val="0"/>
+          <w:tblHeader w:val="0"/>
+        </w:trPr>
+        <w:tc>
+          <w:tcPr>
+            <w:shd w:fill="auto" w:val="clear"/>
+            <w:tcMar>
+              <w:top w:w="100.0" w:type="dxa"/>
+              <w:left w:w="100.0" w:type="dxa"/>
+              <w:bottom w:w="100.0" w:type="dxa"/>
+              <w:right w:w="100.0" w:type="dxa"/>
+            </w:tcMar>
+            <w:vAlign w:val="top"/>
+          </w:tcPr>
+          <w:p>
+            <w:pPr>
+              <w:keepNext w:val="0"/>
+              <w:keepLines w:val="0"/>
+              <w:pageBreakBefore w:val="0"/>
+              <w:widowControl w:val="0"/>
+              <w:pBdr>
+                <w:top w:space="0" w:sz="0" w:val="nil"/>
+                <w:left w:space="0" w:sz="0" w:val="nil"/>
+                <w:bottom w:space="0" w:sz="0" w:val="nil"/>
+                <w:right w:space="0" w:sz="0" w:val="nil"/>
+                <w:between w:space="0" w:sz="0" w:val="nil"/>
+              </w:pBdr>
+              <w:shd w:fill="auto" w:val="clear"/>
+              <w:spacing w:after="0" w:before="0" w:line="240" w:lineRule="auto"/>
+              <w:ind w:left="0" w:right="0" w:firstLine="0"/>
+              <w:jc w:val="left"/>
+              <w:rPr>
+                <w:rFonts w:ascii="Times New Roman" w:cs="Times New Roman" w:eastAsia="Times New Roman" w:hAnsi="Times New Roman"/>
+                <w:sz w:val="24"/>
+                <w:szCs w:val="24"/>
+              </w:rPr>
+            </w:pPr>
+            <w:r>
+              <w:rPr>
+                <w:rFonts w:ascii="Times New Roman" w:cs="Times New Roman" w:eastAsia="Times New Roman" w:hAnsi="Times New Roman"/>
+                <w:sz w:val="24"/>
+                <w:szCs w:val="24"/>
+                <w:rtl w:val="0"/>
+              </w:rPr>
+              <w:t xml:space="preserve">Gris</w:t>
+            </w:r>
+          </w:p>
+        </w:tc>
+        <w:tc>
+          <w:tcPr>
+            <w:shd w:fill="auto" w:val="clear"/>
+            <w:tcMar>
+              <w:top w:w="100.0" w:type="dxa"/>
+              <w:left w:w="100.0" w:type="dxa"/>
+              <w:bottom w:w="100.0" w:type="dxa"/>
+              <w:right w:w="100.0" w:type="dxa"/>
+            </w:tcMar>
+            <w:vAlign w:val="top"/>
+          </w:tcPr>
+          <w:p>
+            <w:pPr>
+              <w:keepNext w:val="0"/>
+              <w:keepLines w:val="0"/>
+              <w:pageBreakBefore w:val="0"/>
+              <w:widowControl w:val="0"/>
+              <w:pBdr>
+                <w:top w:space="0" w:sz="0" w:val="nil"/>
+                <w:left w:space="0" w:sz="0" w:val="nil"/>
+                <w:bottom w:space="0" w:sz="0" w:val="nil"/>
+                <w:right w:space="0" w:sz="0" w:val="nil"/>
+                <w:between w:space="0" w:sz="0" w:val="nil"/>
+              </w:pBdr>
+              <w:shd w:fill="auto" w:val="clear"/>
+              <w:spacing w:after="0" w:before="0" w:line="240" w:lineRule="auto"/>
+              <w:ind w:left="0" w:right="0" w:firstLine="0"/>
+              <w:jc w:val="left"/>
+              <w:rPr>
+                <w:rFonts w:ascii="Times New Roman" w:cs="Times New Roman" w:eastAsia="Times New Roman" w:hAnsi="Times New Roman"/>
+                <w:sz w:val="24"/>
+                <w:szCs w:val="24"/>
+              </w:rPr>
+            </w:pPr>
+            <w:r>
+              <w:rPr>
+                <w:rFonts w:ascii="Times New Roman" w:cs="Times New Roman" w:eastAsia="Times New Roman" w:hAnsi="Times New Roman"/>
+                <w:sz w:val="24"/>
+                <w:szCs w:val="24"/>
+                <w:rtl w:val="0"/>
+              </w:rPr>
+              <w:t xml:space="preserve">Etapa BJT / potencia</w:t>
+            </w:r>
+          </w:p>
+        </w:tc>
+      </w:tr>
+    </w:tbl>
+    <w:p>
+      <w:pPr>
+        <w:pStyle w:val="Heading2"/>
+        <w:spacing w:before="200" w:lineRule="auto"/>
+        <w:rPr>
+          <w:rFonts w:ascii="Times New Roman" w:cs="Times New Roman" w:eastAsia="Times New Roman" w:hAnsi="Times New Roman"/>
+          <w:sz w:val="24"/>
+          <w:szCs w:val="24"/>
+        </w:rPr>
+      </w:pPr>
+      <w:bookmarkStart w:colFirst="0" w:colLast="0" w:name="_bpbxepq63i9g" w:id="23"/>
+      <w:bookmarkEnd w:id="23"/>
       <w:r>
         <w:rPr>
           <w:rFonts w:ascii="Times New Roman" w:cs="Times New Roman" w:eastAsia="Times New Roman" w:hAnsi="Times New Roman"/>
@@ -8489,7 +9418,7 @@
     </w:p>
     <w:tbl>
       <w:tblPr>
-        <w:tblStyle w:val="Table6"/>
+        <w:tblStyle w:val="Table7"/>
         <w:jc w:val="left"/>
         <w:tblBorders>
           <w:top w:color="000000" w:space="0" w:sz="8" w:val="single"/>
@@ -8721,8 +9650,8 @@
           <w:szCs w:val="24"/>
         </w:rPr>
       </w:pPr>
-      <w:bookmarkStart w:colFirst="0" w:colLast="0" w:name="_vpj3qm5kdy5y" w:id="23"/>
-      <w:bookmarkEnd w:id="23"/>
+      <w:bookmarkStart w:colFirst="0" w:colLast="0" w:name="_vpj3qm5kdy5y" w:id="24"/>
+      <w:bookmarkEnd w:id="24"/>
       <w:r>
         <w:rPr>
           <w:rFonts w:ascii="Times New Roman" w:cs="Times New Roman" w:eastAsia="Times New Roman" w:hAnsi="Times New Roman"/>
@@ -8778,7 +9707,7 @@
     </w:p>
     <w:tbl>
       <w:tblPr>
-        <w:tblStyle w:val="Table7"/>
+        <w:tblStyle w:val="Table8"/>
         <w:jc w:val="left"/>
         <w:tblBorders>
           <w:top w:color="000000" w:space="0" w:sz="8" w:val="single"/>
@@ -9032,8 +9961,8 @@
           <w:szCs w:val="24"/>
         </w:rPr>
       </w:pPr>
-      <w:bookmarkStart w:colFirst="0" w:colLast="0" w:name="_ii5c58xm1km8" w:id="24"/>
-      <w:bookmarkEnd w:id="24"/>
+      <w:bookmarkStart w:colFirst="0" w:colLast="0" w:name="_ii5c58xm1km8" w:id="25"/>
+      <w:bookmarkEnd w:id="25"/>
       <w:r>
         <w:rPr>
           <w:rFonts w:ascii="Times New Roman" w:cs="Times New Roman" w:eastAsia="Times New Roman" w:hAnsi="Times New Roman"/>
@@ -9119,552 +10048,6 @@
           <w:rtl w:val="0"/>
         </w:rPr>
         <w:t xml:space="preserve">Figura 5. Circuito combinacional implementado en Tinkercad</w:t>
-      </w:r>
-    </w:p>
-    <w:tbl>
-      <w:tblPr>
-        <w:tblStyle w:val="Table8"/>
-        <w:jc w:val="left"/>
-        <w:tblBorders>
-          <w:top w:color="000000" w:space="0" w:sz="8" w:val="single"/>
-          <w:left w:color="000000" w:space="0" w:sz="8" w:val="single"/>
-          <w:bottom w:color="000000" w:space="0" w:sz="8" w:val="single"/>
-          <w:right w:color="000000" w:space="0" w:sz="8" w:val="single"/>
-          <w:insideH w:color="000000" w:space="0" w:sz="8" w:val="single"/>
-          <w:insideV w:color="000000" w:space="0" w:sz="8" w:val="single"/>
-        </w:tblBorders>
-        <w:tblLayout w:type="fixed"/>
-        <w:tblLook w:val="0600"/>
-      </w:tblPr>
-      <w:tblGrid>
-        <w:gridCol w:w="9029"/>
-        <w:tblGridChange w:id="0">
-          <w:tblGrid>
-            <w:gridCol w:w="9029"/>
-          </w:tblGrid>
-        </w:tblGridChange>
-      </w:tblGrid>
-      <w:tr>
-        <w:trPr>
-          <w:cantSplit w:val="0"/>
-          <w:tblHeader w:val="0"/>
-        </w:trPr>
-        <w:tc>
-          <w:tcPr>
-            <w:shd w:fill="f5f5f5" w:val="clear"/>
-            <w:tcMar>
-              <w:top w:w="100.0" w:type="dxa"/>
-              <w:left w:w="100.0" w:type="dxa"/>
-              <w:bottom w:w="100.0" w:type="dxa"/>
-              <w:right w:w="100.0" w:type="dxa"/>
-            </w:tcMar>
-            <w:vAlign w:val="top"/>
-          </w:tcPr>
-          <w:p>
-            <w:pPr>
-              <w:keepNext w:val="0"/>
-              <w:keepLines w:val="0"/>
-              <w:pageBreakBefore w:val="0"/>
-              <w:widowControl w:val="0"/>
-              <w:pBdr>
-                <w:top w:space="0" w:sz="0" w:val="nil"/>
-                <w:left w:space="0" w:sz="0" w:val="nil"/>
-                <w:bottom w:space="0" w:sz="0" w:val="nil"/>
-                <w:right w:space="0" w:sz="0" w:val="nil"/>
-                <w:between w:space="0" w:sz="0" w:val="nil"/>
-              </w:pBdr>
-              <w:shd w:fill="auto" w:val="clear"/>
-              <w:spacing w:after="0" w:before="0" w:line="276" w:lineRule="auto"/>
-              <w:ind w:left="0" w:right="0" w:firstLine="0"/>
-              <w:jc w:val="left"/>
-              <w:rPr>
-                <w:rFonts w:ascii="Times New Roman" w:cs="Times New Roman" w:eastAsia="Times New Roman" w:hAnsi="Times New Roman"/>
-                <w:i w:val="0"/>
-                <w:iCs w:val="0"/>
-                <w:sz w:val="20"/>
-                <w:szCs w:val="20"/>
-              </w:rPr>
-            </w:pPr>
-            <w:r>
-              <w:rPr>
-                <w:rtl w:val="0"/>
-              </w:rPr>
-            </w:r>
-          </w:p>
-          <w:p>
-            <w:pPr>
-              <w:keepNext w:val="0"/>
-              <w:keepLines w:val="0"/>
-              <w:pageBreakBefore w:val="0"/>
-              <w:widowControl w:val="0"/>
-              <w:pBdr>
-                <w:top w:space="0" w:sz="0" w:val="nil"/>
-                <w:left w:space="0" w:sz="0" w:val="nil"/>
-                <w:bottom w:space="0" w:sz="0" w:val="nil"/>
-                <w:right w:space="0" w:sz="0" w:val="nil"/>
-                <w:between w:space="0" w:sz="0" w:val="nil"/>
-              </w:pBdr>
-              <w:shd w:fill="auto" w:val="clear"/>
-              <w:spacing w:after="0" w:before="0" w:line="276" w:lineRule="auto"/>
-              <w:ind w:left="0" w:right="0" w:firstLine="0"/>
-              <w:jc w:val="left"/>
-              <w:rPr>
-                <w:rFonts w:ascii="Times New Roman" w:cs="Times New Roman" w:eastAsia="Times New Roman" w:hAnsi="Times New Roman"/>
-                <w:i w:val="0"/>
-                <w:iCs w:val="0"/>
-                <w:sz w:val="20"/>
-                <w:szCs w:val="20"/>
-              </w:rPr>
-            </w:pPr>
-            <w:r>
-              <w:rPr>
-                <w:rtl w:val="0"/>
-              </w:rPr>
-            </w:r>
-          </w:p>
-          <w:p>
-            <w:pPr>
-              <w:keepNext w:val="0"/>
-              <w:keepLines w:val="0"/>
-              <w:pageBreakBefore w:val="0"/>
-              <w:widowControl w:val="0"/>
-              <w:pBdr>
-                <w:top w:space="0" w:sz="0" w:val="nil"/>
-                <w:left w:space="0" w:sz="0" w:val="nil"/>
-                <w:bottom w:space="0" w:sz="0" w:val="nil"/>
-                <w:right w:space="0" w:sz="0" w:val="nil"/>
-                <w:between w:space="0" w:sz="0" w:val="nil"/>
-              </w:pBdr>
-              <w:shd w:fill="auto" w:val="clear"/>
-              <w:spacing w:after="0" w:before="0" w:line="276" w:lineRule="auto"/>
-              <w:ind w:left="0" w:right="0" w:firstLine="0"/>
-              <w:jc w:val="left"/>
-              <w:rPr>
-                <w:rFonts w:ascii="Times New Roman" w:cs="Times New Roman" w:eastAsia="Times New Roman" w:hAnsi="Times New Roman"/>
-                <w:i w:val="0"/>
-                <w:iCs w:val="0"/>
-                <w:sz w:val="20"/>
-                <w:szCs w:val="20"/>
-              </w:rPr>
-            </w:pPr>
-            <w:r>
-              <w:rPr>
-                <w:rtl w:val="0"/>
-              </w:rPr>
-            </w:r>
-          </w:p>
-          <w:p>
-            <w:pPr>
-              <w:keepNext w:val="0"/>
-              <w:keepLines w:val="0"/>
-              <w:pageBreakBefore w:val="0"/>
-              <w:widowControl w:val="0"/>
-              <w:pBdr>
-                <w:top w:space="0" w:sz="0" w:val="nil"/>
-                <w:left w:space="0" w:sz="0" w:val="nil"/>
-                <w:bottom w:space="0" w:sz="0" w:val="nil"/>
-                <w:right w:space="0" w:sz="0" w:val="nil"/>
-                <w:between w:space="0" w:sz="0" w:val="nil"/>
-              </w:pBdr>
-              <w:shd w:fill="auto" w:val="clear"/>
-              <w:spacing w:after="0" w:before="0" w:line="276" w:lineRule="auto"/>
-              <w:ind w:left="0" w:right="0" w:firstLine="0"/>
-              <w:jc w:val="left"/>
-              <w:rPr>
-                <w:rFonts w:ascii="Times New Roman" w:cs="Times New Roman" w:eastAsia="Times New Roman" w:hAnsi="Times New Roman"/>
-                <w:i w:val="0"/>
-                <w:iCs w:val="0"/>
-                <w:sz w:val="20"/>
-                <w:szCs w:val="20"/>
-              </w:rPr>
-            </w:pPr>
-            <w:r>
-              <w:rPr>
-                <w:rFonts w:ascii="Times New Roman" w:cs="Times New Roman" w:eastAsia="Times New Roman" w:hAnsi="Times New Roman"/>
-                <w:sz w:val="20"/>
-                <w:szCs w:val="20"/>
-              </w:rPr>
-              <w:drawing>
-                <wp:inline distB="114300" distT="114300" distL="114300" distR="114300">
-                  <wp:extent cx="5715000" cy="1955132"/>
-                  <wp:effectExtent b="0" l="0" r="0" t="0"/>
-                  <wp:docPr id="3" name="image1.png"/>
-                  <a:graphic>
-                    <a:graphicData uri="http://schemas.openxmlformats.org/drawingml/2006/picture">
-                      <pic:pic>
-                        <pic:nvPicPr>
-                          <pic:cNvPr id="0" name="image1.png"/>
-                          <pic:cNvPicPr preferRelativeResize="0"/>
-                        </pic:nvPicPr>
-                        <pic:blipFill>
-                          <a:blip r:embed="rId10"/>
-                          <a:srcRect b="0" l="0" r="0" t="0"/>
-                          <a:stretch>
-                            <a:fillRect/>
-                          </a:stretch>
-                        </pic:blipFill>
-                        <pic:spPr>
-                          <a:xfrm>
-                            <a:off x="0" y="0"/>
-                            <a:ext cx="5715000" cy="1955132"/>
-                          </a:xfrm>
-                          <a:prstGeom prst="rect"/>
-                          <a:ln/>
-                        </pic:spPr>
-                      </pic:pic>
-                    </a:graphicData>
-                  </a:graphic>
-                </wp:inline>
-              </w:drawing>
-            </w:r>
-            <w:r>
-              <w:rPr>
-                <w:rtl w:val="0"/>
-              </w:rPr>
-            </w:r>
-          </w:p>
-          <w:p>
-            <w:pPr>
-              <w:keepNext w:val="0"/>
-              <w:keepLines w:val="0"/>
-              <w:pageBreakBefore w:val="0"/>
-              <w:widowControl w:val="0"/>
-              <w:pBdr>
-                <w:top w:space="0" w:sz="0" w:val="nil"/>
-                <w:left w:space="0" w:sz="0" w:val="nil"/>
-                <w:bottom w:space="0" w:sz="0" w:val="nil"/>
-                <w:right w:space="0" w:sz="0" w:val="nil"/>
-                <w:between w:space="0" w:sz="0" w:val="nil"/>
-              </w:pBdr>
-              <w:shd w:fill="auto" w:val="clear"/>
-              <w:spacing w:after="0" w:before="0" w:line="276" w:lineRule="auto"/>
-              <w:ind w:left="0" w:right="0" w:firstLine="0"/>
-              <w:jc w:val="left"/>
-              <w:rPr>
-                <w:rFonts w:ascii="Times New Roman" w:cs="Times New Roman" w:eastAsia="Times New Roman" w:hAnsi="Times New Roman"/>
-                <w:i w:val="0"/>
-                <w:iCs w:val="0"/>
-                <w:sz w:val="20"/>
-                <w:szCs w:val="20"/>
-              </w:rPr>
-            </w:pPr>
-            <w:r>
-              <w:rPr>
-                <w:rtl w:val="0"/>
-              </w:rPr>
-            </w:r>
-          </w:p>
-          <w:p>
-            <w:pPr>
-              <w:keepNext w:val="0"/>
-              <w:keepLines w:val="0"/>
-              <w:pageBreakBefore w:val="0"/>
-              <w:widowControl w:val="0"/>
-              <w:pBdr>
-                <w:top w:space="0" w:sz="0" w:val="nil"/>
-                <w:left w:space="0" w:sz="0" w:val="nil"/>
-                <w:bottom w:space="0" w:sz="0" w:val="nil"/>
-                <w:right w:space="0" w:sz="0" w:val="nil"/>
-                <w:between w:space="0" w:sz="0" w:val="nil"/>
-              </w:pBdr>
-              <w:shd w:fill="auto" w:val="clear"/>
-              <w:spacing w:after="0" w:before="0" w:line="276" w:lineRule="auto"/>
-              <w:ind w:left="0" w:right="0" w:firstLine="0"/>
-              <w:jc w:val="left"/>
-              <w:rPr>
-                <w:rFonts w:ascii="Times New Roman" w:cs="Times New Roman" w:eastAsia="Times New Roman" w:hAnsi="Times New Roman"/>
-                <w:i w:val="0"/>
-                <w:iCs w:val="0"/>
-                <w:sz w:val="20"/>
-                <w:szCs w:val="20"/>
-              </w:rPr>
-            </w:pPr>
-            <w:r>
-              <w:rPr>
-                <w:rtl w:val="0"/>
-              </w:rPr>
-            </w:r>
-          </w:p>
-          <w:p>
-            <w:pPr>
-              <w:keepNext w:val="0"/>
-              <w:keepLines w:val="0"/>
-              <w:pageBreakBefore w:val="0"/>
-              <w:widowControl w:val="0"/>
-              <w:pBdr>
-                <w:top w:space="0" w:sz="0" w:val="nil"/>
-                <w:left w:space="0" w:sz="0" w:val="nil"/>
-                <w:bottom w:space="0" w:sz="0" w:val="nil"/>
-                <w:right w:space="0" w:sz="0" w:val="nil"/>
-                <w:between w:space="0" w:sz="0" w:val="nil"/>
-              </w:pBdr>
-              <w:shd w:fill="auto" w:val="clear"/>
-              <w:spacing w:after="0" w:before="0" w:line="276" w:lineRule="auto"/>
-              <w:ind w:left="0" w:right="0" w:firstLine="0"/>
-              <w:jc w:val="left"/>
-              <w:rPr>
-                <w:rFonts w:ascii="Times New Roman" w:cs="Times New Roman" w:eastAsia="Times New Roman" w:hAnsi="Times New Roman"/>
-                <w:i w:val="0"/>
-                <w:iCs w:val="0"/>
-                <w:sz w:val="20"/>
-                <w:szCs w:val="20"/>
-              </w:rPr>
-            </w:pPr>
-            <w:r>
-              <w:rPr>
-                <w:rtl w:val="0"/>
-              </w:rPr>
-            </w:r>
-          </w:p>
-        </w:tc>
-      </w:tr>
-    </w:tbl>
-    <w:p>
-      <w:pPr>
-        <w:keepNext w:val="0"/>
-        <w:keepLines w:val="0"/>
-        <w:pageBreakBefore w:val="0"/>
-        <w:widowControl w:val="0"/>
-        <w:pBdr>
-          <w:top w:space="0" w:sz="0" w:val="nil"/>
-          <w:left w:space="0" w:sz="0" w:val="nil"/>
-          <w:bottom w:space="0" w:sz="0" w:val="nil"/>
-          <w:right w:space="0" w:sz="0" w:val="nil"/>
-          <w:between w:space="0" w:sz="0" w:val="nil"/>
-        </w:pBdr>
-        <w:shd w:fill="auto" w:val="clear"/>
-        <w:spacing w:after="0" w:before="0" w:line="276" w:lineRule="auto"/>
-        <w:ind w:left="0" w:right="0" w:firstLine="0"/>
-        <w:jc w:val="left"/>
-        <w:rPr>
-          <w:rFonts w:ascii="Times New Roman" w:cs="Times New Roman" w:eastAsia="Times New Roman" w:hAnsi="Times New Roman"/>
-          <w:i w:val="0"/>
-          <w:iCs w:val="0"/>
-          <w:sz w:val="22"/>
-          <w:szCs w:val="22"/>
-        </w:rPr>
-      </w:pPr>
-      <w:r>
-        <w:rPr>
-          <w:rtl w:val="0"/>
-        </w:rPr>
-      </w:r>
-    </w:p>
-    <w:p>
-      <w:pPr>
-        <w:keepNext w:val="0"/>
-        <w:keepLines w:val="0"/>
-        <w:pageBreakBefore w:val="0"/>
-        <w:widowControl w:val="0"/>
-        <w:pBdr>
-          <w:top w:space="0" w:sz="0" w:val="nil"/>
-          <w:left w:space="0" w:sz="0" w:val="nil"/>
-          <w:bottom w:space="0" w:sz="0" w:val="nil"/>
-          <w:right w:space="0" w:sz="0" w:val="nil"/>
-          <w:between w:space="0" w:sz="0" w:val="nil"/>
-        </w:pBdr>
-        <w:shd w:fill="auto" w:val="clear"/>
-        <w:spacing w:after="200" w:before="0" w:line="360" w:lineRule="auto"/>
-        <w:ind w:left="0" w:right="0" w:firstLine="0"/>
-        <w:jc w:val="both"/>
-        <w:rPr>
-          <w:rFonts w:ascii="Times New Roman" w:cs="Times New Roman" w:eastAsia="Times New Roman" w:hAnsi="Times New Roman"/>
-          <w:i w:val="1"/>
-          <w:iCs w:val="1"/>
-          <w:sz w:val="20"/>
-          <w:szCs w:val="20"/>
-        </w:rPr>
-      </w:pPr>
-      <w:r>
-        <w:rPr>
-          <w:rFonts w:ascii="Times New Roman" w:cs="Times New Roman" w:eastAsia="Times New Roman" w:hAnsi="Times New Roman"/>
-          <w:i w:val="1"/>
-          <w:iCs w:val="1"/>
-          <w:sz w:val="20"/>
-          <w:szCs w:val="20"/>
-          <w:rtl w:val="0"/>
-        </w:rPr>
-        <w:t xml:space="preserve">Nota. Evidencia obtenida durante el desarrollo de la Etapa 1.</w:t>
-      </w:r>
-    </w:p>
-    <w:p>
-      <w:pPr>
-        <w:pStyle w:val="Heading1"/>
-        <w:spacing w:after="160" w:before="280" w:lineRule="auto"/>
-        <w:rPr>
-          <w:rFonts w:ascii="Times New Roman" w:cs="Times New Roman" w:eastAsia="Times New Roman" w:hAnsi="Times New Roman"/>
-          <w:sz w:val="28"/>
-          <w:szCs w:val="28"/>
-        </w:rPr>
-      </w:pPr>
-      <w:bookmarkStart w:colFirst="0" w:colLast="0" w:name="_ehlcxlcvy0dl" w:id="25"/>
-      <w:bookmarkEnd w:id="25"/>
-      <w:r>
-        <w:rPr>
-          <w:rFonts w:ascii="Times New Roman" w:cs="Times New Roman" w:eastAsia="Times New Roman" w:hAnsi="Times New Roman"/>
-          <w:sz w:val="28"/>
-          <w:szCs w:val="28"/>
-          <w:rtl w:val="0"/>
-        </w:rPr>
-        <w:t xml:space="preserve">11. INTERFAZ DIGITAL-ANALÓGICA CON TRANSISTOR BJT</w:t>
-      </w:r>
-    </w:p>
-    <w:p>
-      <w:pPr>
-        <w:keepNext w:val="0"/>
-        <w:keepLines w:val="0"/>
-        <w:pageBreakBefore w:val="0"/>
-        <w:widowControl w:val="0"/>
-        <w:pBdr>
-          <w:top w:space="0" w:sz="0" w:val="nil"/>
-          <w:left w:space="0" w:sz="0" w:val="nil"/>
-          <w:bottom w:space="0" w:sz="0" w:val="nil"/>
-          <w:right w:space="0" w:sz="0" w:val="nil"/>
-          <w:between w:space="0" w:sz="0" w:val="nil"/>
-        </w:pBdr>
-        <w:shd w:fill="auto" w:val="clear"/>
-        <w:spacing w:after="120" w:before="0" w:line="360" w:lineRule="auto"/>
-        <w:ind w:left="0" w:right="0" w:firstLine="0"/>
-        <w:jc w:val="both"/>
-        <w:rPr>
-          <w:rFonts w:ascii="Times New Roman" w:cs="Times New Roman" w:eastAsia="Times New Roman" w:hAnsi="Times New Roman"/>
-          <w:i w:val="0"/>
-          <w:iCs w:val="0"/>
-          <w:sz w:val="24"/>
-          <w:szCs w:val="24"/>
-        </w:rPr>
-      </w:pPr>
-      <w:r>
-        <w:rPr>
-          <w:rFonts w:ascii="Times New Roman" w:cs="Times New Roman" w:eastAsia="Times New Roman" w:hAnsi="Times New Roman"/>
-          <w:sz w:val="24"/>
-          <w:szCs w:val="24"/>
-          <w:rtl w:val="0"/>
-        </w:rPr>
-        <w:t xml:space="preserve">La etapa de interfaz se implementó y validó después de comprobar el funcionamiento correcto de la lógica digital.</w:t>
-      </w:r>
-      <w:r>
-        <w:rPr>
-          <w:rtl w:val="0"/>
-        </w:rPr>
-      </w:r>
-    </w:p>
-    <w:p>
-      <w:pPr>
-        <w:keepNext w:val="0"/>
-        <w:keepLines w:val="0"/>
-        <w:pageBreakBefore w:val="0"/>
-        <w:widowControl w:val="0"/>
-        <w:pBdr>
-          <w:top w:space="0" w:sz="0" w:val="nil"/>
-          <w:left w:space="0" w:sz="0" w:val="nil"/>
-          <w:bottom w:space="0" w:sz="0" w:val="nil"/>
-          <w:right w:space="0" w:sz="0" w:val="nil"/>
-          <w:between w:space="0" w:sz="0" w:val="nil"/>
-        </w:pBdr>
-        <w:shd w:fill="auto" w:val="clear"/>
-        <w:spacing w:after="120" w:before="0" w:line="360" w:lineRule="auto"/>
-        <w:ind w:left="0" w:right="0" w:firstLine="0"/>
-        <w:jc w:val="both"/>
-        <w:rPr>
-          <w:rFonts w:ascii="Times New Roman" w:cs="Times New Roman" w:eastAsia="Times New Roman" w:hAnsi="Times New Roman"/>
-          <w:i w:val="0"/>
-          <w:iCs w:val="0"/>
-          <w:sz w:val="24"/>
-          <w:szCs w:val="24"/>
-        </w:rPr>
-      </w:pPr>
-      <w:r>
-        <w:rPr>
-          <w:rFonts w:ascii="Times New Roman" w:cs="Times New Roman" w:eastAsia="Times New Roman" w:hAnsi="Times New Roman"/>
-          <w:sz w:val="24"/>
-          <w:szCs w:val="24"/>
-          <w:rtl w:val="0"/>
-        </w:rPr>
-        <w:t xml:space="preserve">La salida F del 74HC32 se conectó a la base de un transistor NPN a través de una resistencia de 1 kΩ. El emisor se conectó a GND y el colector al terminal de retorno del motor, de manera que el transistor actúa como interruptor y evita que la salida lógica alimente directamente la carga.</w:t>
-      </w:r>
-      <w:r>
-        <w:rPr>
-          <w:rtl w:val="0"/>
-        </w:rPr>
-      </w:r>
-    </w:p>
-    <w:p>
-      <w:pPr>
-        <w:keepNext w:val="0"/>
-        <w:keepLines w:val="0"/>
-        <w:pageBreakBefore w:val="0"/>
-        <w:widowControl w:val="0"/>
-        <w:pBdr>
-          <w:top w:space="0" w:sz="0" w:val="nil"/>
-          <w:left w:space="0" w:sz="0" w:val="nil"/>
-          <w:bottom w:space="0" w:sz="0" w:val="nil"/>
-          <w:right w:space="0" w:sz="0" w:val="nil"/>
-          <w:between w:space="0" w:sz="0" w:val="nil"/>
-        </w:pBdr>
-        <w:shd w:fill="auto" w:val="clear"/>
-        <w:spacing w:after="120" w:before="0" w:line="360" w:lineRule="auto"/>
-        <w:ind w:left="0" w:right="0" w:firstLine="0"/>
-        <w:jc w:val="both"/>
-        <w:rPr>
-          <w:rFonts w:ascii="Times New Roman" w:cs="Times New Roman" w:eastAsia="Times New Roman" w:hAnsi="Times New Roman"/>
-          <w:i w:val="0"/>
-          <w:iCs w:val="0"/>
-          <w:sz w:val="24"/>
-          <w:szCs w:val="24"/>
-        </w:rPr>
-      </w:pPr>
-      <w:r>
-        <w:rPr>
-          <w:rFonts w:ascii="Times New Roman" w:cs="Times New Roman" w:eastAsia="Times New Roman" w:hAnsi="Times New Roman"/>
-          <w:sz w:val="24"/>
-          <w:szCs w:val="24"/>
-          <w:rtl w:val="0"/>
-        </w:rPr>
-        <w:t xml:space="preserve">Para representar la electroválvula en Tinkercad se utilizó un motor de CC como carga inductiva. Se añadió un diodo flyback en paralelo con el motor, con el cátodo hacia +5 V y el ánodo hacia el colector del transistor, protegiendo la etapa de conmutación frente a la tensión inducida al desconectar la carga.</w:t>
-      </w:r>
-      <w:r>
-        <w:rPr>
-          <w:rtl w:val="0"/>
-        </w:rPr>
-      </w:r>
-    </w:p>
-    <w:p>
-      <w:pPr>
-        <w:keepNext w:val="0"/>
-        <w:keepLines w:val="0"/>
-        <w:pageBreakBefore w:val="0"/>
-        <w:widowControl w:val="0"/>
-        <w:pBdr>
-          <w:top w:space="0" w:sz="0" w:val="nil"/>
-          <w:left w:space="0" w:sz="0" w:val="nil"/>
-          <w:bottom w:space="0" w:sz="0" w:val="nil"/>
-          <w:right w:space="0" w:sz="0" w:val="nil"/>
-          <w:between w:space="0" w:sz="0" w:val="nil"/>
-        </w:pBdr>
-        <w:shd w:fill="auto" w:val="clear"/>
-        <w:spacing w:after="80" w:before="200" w:line="360" w:lineRule="auto"/>
-        <w:ind w:left="0" w:right="0" w:firstLine="0"/>
-        <w:jc w:val="both"/>
-        <w:rPr>
-          <w:rFonts w:ascii="Times New Roman" w:cs="Times New Roman" w:eastAsia="Times New Roman" w:hAnsi="Times New Roman"/>
-          <w:i w:val="0"/>
-          <w:iCs w:val="0"/>
-          <w:sz w:val="22"/>
-          <w:szCs w:val="22"/>
-        </w:rPr>
-      </w:pPr>
-      <w:r>
-        <w:rPr>
-          <w:rFonts w:ascii="Times New Roman" w:cs="Times New Roman" w:eastAsia="Times New Roman" w:hAnsi="Times New Roman"/>
-          <w:rtl w:val="0"/>
-        </w:rPr>
-        <w:t xml:space="preserve">Figura 6. Interfaz de potencia con transistor NPN, resistencia de base y diodo flyback para accionamiento del motor.</w:t>
-      </w:r>
-      <w:r>
-        <w:rPr>
-          <w:rtl w:val="0"/>
-        </w:rPr>
       </w:r>
     </w:p>
     <w:tbl>
@@ -9832,14 +10215,560 @@
               </w:rPr>
               <w:drawing>
                 <wp:inline distB="114300" distT="114300" distL="114300" distR="114300">
-                  <wp:extent cx="5334000" cy="3718724"/>
+                  <wp:extent cx="5715000" cy="1955132"/>
                   <wp:effectExtent b="0" l="0" r="0" t="0"/>
-                  <wp:docPr id="5" name="image7.png"/>
+                  <wp:docPr id="3" name="image3.png"/>
                   <a:graphic>
                     <a:graphicData uri="http://schemas.openxmlformats.org/drawingml/2006/picture">
                       <pic:pic>
                         <pic:nvPicPr>
-                          <pic:cNvPr id="0" name="image7.png"/>
+                          <pic:cNvPr id="0" name="image3.png"/>
+                          <pic:cNvPicPr preferRelativeResize="0"/>
+                        </pic:nvPicPr>
+                        <pic:blipFill>
+                          <a:blip r:embed="rId10"/>
+                          <a:srcRect b="0" l="0" r="0" t="0"/>
+                          <a:stretch>
+                            <a:fillRect/>
+                          </a:stretch>
+                        </pic:blipFill>
+                        <pic:spPr>
+                          <a:xfrm>
+                            <a:off x="0" y="0"/>
+                            <a:ext cx="5715000" cy="1955132"/>
+                          </a:xfrm>
+                          <a:prstGeom prst="rect"/>
+                          <a:ln/>
+                        </pic:spPr>
+                      </pic:pic>
+                    </a:graphicData>
+                  </a:graphic>
+                </wp:inline>
+              </w:drawing>
+            </w:r>
+            <w:r>
+              <w:rPr>
+                <w:rtl w:val="0"/>
+              </w:rPr>
+            </w:r>
+          </w:p>
+          <w:p>
+            <w:pPr>
+              <w:keepNext w:val="0"/>
+              <w:keepLines w:val="0"/>
+              <w:pageBreakBefore w:val="0"/>
+              <w:widowControl w:val="0"/>
+              <w:pBdr>
+                <w:top w:space="0" w:sz="0" w:val="nil"/>
+                <w:left w:space="0" w:sz="0" w:val="nil"/>
+                <w:bottom w:space="0" w:sz="0" w:val="nil"/>
+                <w:right w:space="0" w:sz="0" w:val="nil"/>
+                <w:between w:space="0" w:sz="0" w:val="nil"/>
+              </w:pBdr>
+              <w:shd w:fill="auto" w:val="clear"/>
+              <w:spacing w:after="0" w:before="0" w:line="276" w:lineRule="auto"/>
+              <w:ind w:left="0" w:right="0" w:firstLine="0"/>
+              <w:jc w:val="left"/>
+              <w:rPr>
+                <w:rFonts w:ascii="Times New Roman" w:cs="Times New Roman" w:eastAsia="Times New Roman" w:hAnsi="Times New Roman"/>
+                <w:i w:val="0"/>
+                <w:iCs w:val="0"/>
+                <w:sz w:val="20"/>
+                <w:szCs w:val="20"/>
+              </w:rPr>
+            </w:pPr>
+            <w:r>
+              <w:rPr>
+                <w:rtl w:val="0"/>
+              </w:rPr>
+            </w:r>
+          </w:p>
+          <w:p>
+            <w:pPr>
+              <w:keepNext w:val="0"/>
+              <w:keepLines w:val="0"/>
+              <w:pageBreakBefore w:val="0"/>
+              <w:widowControl w:val="0"/>
+              <w:pBdr>
+                <w:top w:space="0" w:sz="0" w:val="nil"/>
+                <w:left w:space="0" w:sz="0" w:val="nil"/>
+                <w:bottom w:space="0" w:sz="0" w:val="nil"/>
+                <w:right w:space="0" w:sz="0" w:val="nil"/>
+                <w:between w:space="0" w:sz="0" w:val="nil"/>
+              </w:pBdr>
+              <w:shd w:fill="auto" w:val="clear"/>
+              <w:spacing w:after="0" w:before="0" w:line="276" w:lineRule="auto"/>
+              <w:ind w:left="0" w:right="0" w:firstLine="0"/>
+              <w:jc w:val="left"/>
+              <w:rPr>
+                <w:rFonts w:ascii="Times New Roman" w:cs="Times New Roman" w:eastAsia="Times New Roman" w:hAnsi="Times New Roman"/>
+                <w:i w:val="0"/>
+                <w:iCs w:val="0"/>
+                <w:sz w:val="20"/>
+                <w:szCs w:val="20"/>
+              </w:rPr>
+            </w:pPr>
+            <w:r>
+              <w:rPr>
+                <w:rtl w:val="0"/>
+              </w:rPr>
+            </w:r>
+          </w:p>
+          <w:p>
+            <w:pPr>
+              <w:keepNext w:val="0"/>
+              <w:keepLines w:val="0"/>
+              <w:pageBreakBefore w:val="0"/>
+              <w:widowControl w:val="0"/>
+              <w:pBdr>
+                <w:top w:space="0" w:sz="0" w:val="nil"/>
+                <w:left w:space="0" w:sz="0" w:val="nil"/>
+                <w:bottom w:space="0" w:sz="0" w:val="nil"/>
+                <w:right w:space="0" w:sz="0" w:val="nil"/>
+                <w:between w:space="0" w:sz="0" w:val="nil"/>
+              </w:pBdr>
+              <w:shd w:fill="auto" w:val="clear"/>
+              <w:spacing w:after="0" w:before="0" w:line="276" w:lineRule="auto"/>
+              <w:ind w:left="0" w:right="0" w:firstLine="0"/>
+              <w:jc w:val="left"/>
+              <w:rPr>
+                <w:rFonts w:ascii="Times New Roman" w:cs="Times New Roman" w:eastAsia="Times New Roman" w:hAnsi="Times New Roman"/>
+                <w:i w:val="0"/>
+                <w:iCs w:val="0"/>
+                <w:sz w:val="20"/>
+                <w:szCs w:val="20"/>
+              </w:rPr>
+            </w:pPr>
+            <w:r>
+              <w:rPr>
+                <w:rtl w:val="0"/>
+              </w:rPr>
+            </w:r>
+          </w:p>
+        </w:tc>
+      </w:tr>
+    </w:tbl>
+    <w:p>
+      <w:pPr>
+        <w:keepNext w:val="0"/>
+        <w:keepLines w:val="0"/>
+        <w:pageBreakBefore w:val="0"/>
+        <w:widowControl w:val="0"/>
+        <w:pBdr>
+          <w:top w:space="0" w:sz="0" w:val="nil"/>
+          <w:left w:space="0" w:sz="0" w:val="nil"/>
+          <w:bottom w:space="0" w:sz="0" w:val="nil"/>
+          <w:right w:space="0" w:sz="0" w:val="nil"/>
+          <w:between w:space="0" w:sz="0" w:val="nil"/>
+        </w:pBdr>
+        <w:shd w:fill="auto" w:val="clear"/>
+        <w:spacing w:after="0" w:before="0" w:line="276" w:lineRule="auto"/>
+        <w:ind w:left="0" w:right="0" w:firstLine="0"/>
+        <w:jc w:val="left"/>
+        <w:rPr>
+          <w:rFonts w:ascii="Times New Roman" w:cs="Times New Roman" w:eastAsia="Times New Roman" w:hAnsi="Times New Roman"/>
+          <w:i w:val="0"/>
+          <w:iCs w:val="0"/>
+          <w:sz w:val="22"/>
+          <w:szCs w:val="22"/>
+        </w:rPr>
+      </w:pPr>
+      <w:r>
+        <w:rPr>
+          <w:rtl w:val="0"/>
+        </w:rPr>
+      </w:r>
+    </w:p>
+    <w:p>
+      <w:pPr>
+        <w:keepNext w:val="0"/>
+        <w:keepLines w:val="0"/>
+        <w:pageBreakBefore w:val="0"/>
+        <w:widowControl w:val="0"/>
+        <w:pBdr>
+          <w:top w:space="0" w:sz="0" w:val="nil"/>
+          <w:left w:space="0" w:sz="0" w:val="nil"/>
+          <w:bottom w:space="0" w:sz="0" w:val="nil"/>
+          <w:right w:space="0" w:sz="0" w:val="nil"/>
+          <w:between w:space="0" w:sz="0" w:val="nil"/>
+        </w:pBdr>
+        <w:shd w:fill="auto" w:val="clear"/>
+        <w:spacing w:after="200" w:before="0" w:line="360" w:lineRule="auto"/>
+        <w:ind w:left="0" w:right="0" w:firstLine="0"/>
+        <w:jc w:val="both"/>
+        <w:rPr>
+          <w:rFonts w:ascii="Times New Roman" w:cs="Times New Roman" w:eastAsia="Times New Roman" w:hAnsi="Times New Roman"/>
+          <w:i w:val="1"/>
+          <w:iCs w:val="1"/>
+          <w:sz w:val="20"/>
+          <w:szCs w:val="20"/>
+        </w:rPr>
+      </w:pPr>
+      <w:r>
+        <w:rPr>
+          <w:rFonts w:ascii="Times New Roman" w:cs="Times New Roman" w:eastAsia="Times New Roman" w:hAnsi="Times New Roman"/>
+          <w:i w:val="1"/>
+          <w:iCs w:val="1"/>
+          <w:sz w:val="20"/>
+          <w:szCs w:val="20"/>
+          <w:rtl w:val="0"/>
+        </w:rPr>
+        <w:t xml:space="preserve">Nota. Evidencia obtenida durante el desarrollo de la Etapa 1.</w:t>
+      </w:r>
+    </w:p>
+    <w:p>
+      <w:pPr>
+        <w:pStyle w:val="Heading1"/>
+        <w:spacing w:after="160" w:before="280" w:lineRule="auto"/>
+        <w:rPr>
+          <w:rFonts w:ascii="Times New Roman" w:cs="Times New Roman" w:eastAsia="Times New Roman" w:hAnsi="Times New Roman"/>
+          <w:sz w:val="28"/>
+          <w:szCs w:val="28"/>
+        </w:rPr>
+      </w:pPr>
+      <w:bookmarkStart w:colFirst="0" w:colLast="0" w:name="_ehlcxlcvy0dl" w:id="26"/>
+      <w:bookmarkEnd w:id="26"/>
+      <w:r>
+        <w:rPr>
+          <w:rFonts w:ascii="Times New Roman" w:cs="Times New Roman" w:eastAsia="Times New Roman" w:hAnsi="Times New Roman"/>
+          <w:sz w:val="28"/>
+          <w:szCs w:val="28"/>
+          <w:rtl w:val="0"/>
+        </w:rPr>
+        <w:t xml:space="preserve">11. INTERFAZ DIGITAL-ANALÓGICA CON TRANSISTOR BJT</w:t>
+      </w:r>
+    </w:p>
+    <w:p>
+      <w:pPr>
+        <w:keepNext w:val="0"/>
+        <w:keepLines w:val="0"/>
+        <w:pageBreakBefore w:val="0"/>
+        <w:widowControl w:val="0"/>
+        <w:pBdr>
+          <w:top w:space="0" w:sz="0" w:val="nil"/>
+          <w:left w:space="0" w:sz="0" w:val="nil"/>
+          <w:bottom w:space="0" w:sz="0" w:val="nil"/>
+          <w:right w:space="0" w:sz="0" w:val="nil"/>
+          <w:between w:space="0" w:sz="0" w:val="nil"/>
+        </w:pBdr>
+        <w:shd w:fill="auto" w:val="clear"/>
+        <w:spacing w:after="120" w:before="0" w:line="360" w:lineRule="auto"/>
+        <w:ind w:left="0" w:right="0" w:firstLine="0"/>
+        <w:jc w:val="both"/>
+        <w:rPr>
+          <w:rFonts w:ascii="Times New Roman" w:cs="Times New Roman" w:eastAsia="Times New Roman" w:hAnsi="Times New Roman"/>
+          <w:i w:val="0"/>
+          <w:iCs w:val="0"/>
+          <w:sz w:val="24"/>
+          <w:szCs w:val="24"/>
+        </w:rPr>
+      </w:pPr>
+      <w:r>
+        <w:rPr>
+          <w:rFonts w:ascii="Times New Roman" w:cs="Times New Roman" w:eastAsia="Times New Roman" w:hAnsi="Times New Roman"/>
+          <w:sz w:val="24"/>
+          <w:szCs w:val="24"/>
+          <w:rtl w:val="0"/>
+        </w:rPr>
+        <w:t xml:space="preserve">La etapa de interfaz se implementó y validó después de comprobar el funcionamiento correcto de la lógica digital.</w:t>
+      </w:r>
+      <w:r>
+        <w:rPr>
+          <w:rtl w:val="0"/>
+        </w:rPr>
+      </w:r>
+    </w:p>
+    <w:p>
+      <w:pPr>
+        <w:keepNext w:val="0"/>
+        <w:keepLines w:val="0"/>
+        <w:pageBreakBefore w:val="0"/>
+        <w:widowControl w:val="0"/>
+        <w:pBdr>
+          <w:top w:space="0" w:sz="0" w:val="nil"/>
+          <w:left w:space="0" w:sz="0" w:val="nil"/>
+          <w:bottom w:space="0" w:sz="0" w:val="nil"/>
+          <w:right w:space="0" w:sz="0" w:val="nil"/>
+          <w:between w:space="0" w:sz="0" w:val="nil"/>
+        </w:pBdr>
+        <w:shd w:fill="auto" w:val="clear"/>
+        <w:spacing w:after="120" w:before="0" w:line="360" w:lineRule="auto"/>
+        <w:ind w:left="0" w:right="0" w:firstLine="0"/>
+        <w:jc w:val="both"/>
+        <w:rPr>
+          <w:rFonts w:ascii="Times New Roman" w:cs="Times New Roman" w:eastAsia="Times New Roman" w:hAnsi="Times New Roman"/>
+          <w:i w:val="0"/>
+          <w:iCs w:val="0"/>
+          <w:sz w:val="24"/>
+          <w:szCs w:val="24"/>
+        </w:rPr>
+      </w:pPr>
+      <w:r>
+        <w:rPr>
+          <w:rFonts w:ascii="Times New Roman" w:cs="Times New Roman" w:eastAsia="Times New Roman" w:hAnsi="Times New Roman"/>
+          <w:sz w:val="24"/>
+          <w:szCs w:val="24"/>
+          <w:rtl w:val="0"/>
+        </w:rPr>
+        <w:t xml:space="preserve">La salida F del 74HC32 se conectó a la base de un transistor NPN a través de una resistencia de 1 kΩ. El emisor se conectó a GND y el colector al terminal de retorno del motor, de manera que el transistor actúa como interruptor y evita que la salida lógica alimente directamente la carga.</w:t>
+      </w:r>
+      <w:r>
+        <w:rPr>
+          <w:rtl w:val="0"/>
+        </w:rPr>
+      </w:r>
+    </w:p>
+    <w:p>
+      <w:pPr>
+        <w:keepNext w:val="0"/>
+        <w:keepLines w:val="0"/>
+        <w:pageBreakBefore w:val="0"/>
+        <w:widowControl w:val="0"/>
+        <w:pBdr>
+          <w:top w:space="0" w:sz="0" w:val="nil"/>
+          <w:left w:space="0" w:sz="0" w:val="nil"/>
+          <w:bottom w:space="0" w:sz="0" w:val="nil"/>
+          <w:right w:space="0" w:sz="0" w:val="nil"/>
+          <w:between w:space="0" w:sz="0" w:val="nil"/>
+        </w:pBdr>
+        <w:shd w:fill="auto" w:val="clear"/>
+        <w:spacing w:after="120" w:before="0" w:line="360" w:lineRule="auto"/>
+        <w:ind w:left="0" w:right="0" w:firstLine="0"/>
+        <w:jc w:val="both"/>
+        <w:rPr>
+          <w:rFonts w:ascii="Times New Roman" w:cs="Times New Roman" w:eastAsia="Times New Roman" w:hAnsi="Times New Roman"/>
+          <w:i w:val="0"/>
+          <w:iCs w:val="0"/>
+          <w:sz w:val="24"/>
+          <w:szCs w:val="24"/>
+        </w:rPr>
+      </w:pPr>
+      <w:r>
+        <w:rPr>
+          <w:rFonts w:ascii="Times New Roman" w:cs="Times New Roman" w:eastAsia="Times New Roman" w:hAnsi="Times New Roman"/>
+          <w:sz w:val="24"/>
+          <w:szCs w:val="24"/>
+          <w:rtl w:val="0"/>
+        </w:rPr>
+        <w:t xml:space="preserve">Para representar la electroválvula en Tinkercad se utilizó un motor de CC como carga inductiva. Se añadió un diodo flyback en paralelo con el motor, con el cátodo hacia +5 V y el ánodo hacia el colector del transistor, protegiendo la etapa de conmutación frente a la tensión inducida al desconectar la carga.</w:t>
+      </w:r>
+      <w:r>
+        <w:rPr>
+          <w:rtl w:val="0"/>
+        </w:rPr>
+      </w:r>
+    </w:p>
+    <w:p>
+      <w:pPr>
+        <w:keepNext w:val="0"/>
+        <w:keepLines w:val="0"/>
+        <w:pageBreakBefore w:val="0"/>
+        <w:widowControl w:val="0"/>
+        <w:pBdr>
+          <w:top w:space="0" w:sz="0" w:val="nil"/>
+          <w:left w:space="0" w:sz="0" w:val="nil"/>
+          <w:bottom w:space="0" w:sz="0" w:val="nil"/>
+          <w:right w:space="0" w:sz="0" w:val="nil"/>
+          <w:between w:space="0" w:sz="0" w:val="nil"/>
+        </w:pBdr>
+        <w:shd w:fill="auto" w:val="clear"/>
+        <w:spacing w:after="80" w:before="200" w:line="360" w:lineRule="auto"/>
+        <w:ind w:left="0" w:right="0" w:firstLine="0"/>
+        <w:jc w:val="both"/>
+        <w:rPr>
+          <w:rFonts w:ascii="Times New Roman" w:cs="Times New Roman" w:eastAsia="Times New Roman" w:hAnsi="Times New Roman"/>
+          <w:i w:val="0"/>
+          <w:iCs w:val="0"/>
+          <w:sz w:val="22"/>
+          <w:szCs w:val="22"/>
+        </w:rPr>
+      </w:pPr>
+      <w:r>
+        <w:rPr>
+          <w:rFonts w:ascii="Times New Roman" w:cs="Times New Roman" w:eastAsia="Times New Roman" w:hAnsi="Times New Roman"/>
+          <w:rtl w:val="0"/>
+        </w:rPr>
+        <w:t xml:space="preserve">Figura 6. Interfaz de potencia con transistor NPN, resistencia de base y diodo flyback para accionamiento del motor.</w:t>
+      </w:r>
+      <w:r>
+        <w:rPr>
+          <w:rtl w:val="0"/>
+        </w:rPr>
+      </w:r>
+    </w:p>
+    <w:tbl>
+      <w:tblPr>
+        <w:tblStyle w:val="Table10"/>
+        <w:jc w:val="left"/>
+        <w:tblBorders>
+          <w:top w:color="000000" w:space="0" w:sz="8" w:val="single"/>
+          <w:left w:color="000000" w:space="0" w:sz="8" w:val="single"/>
+          <w:bottom w:color="000000" w:space="0" w:sz="8" w:val="single"/>
+          <w:right w:color="000000" w:space="0" w:sz="8" w:val="single"/>
+          <w:insideH w:color="000000" w:space="0" w:sz="8" w:val="single"/>
+          <w:insideV w:color="000000" w:space="0" w:sz="8" w:val="single"/>
+        </w:tblBorders>
+        <w:tblLayout w:type="fixed"/>
+        <w:tblLook w:val="0600"/>
+      </w:tblPr>
+      <w:tblGrid>
+        <w:gridCol w:w="9029"/>
+        <w:tblGridChange w:id="0">
+          <w:tblGrid>
+            <w:gridCol w:w="9029"/>
+          </w:tblGrid>
+        </w:tblGridChange>
+      </w:tblGrid>
+      <w:tr>
+        <w:trPr>
+          <w:cantSplit w:val="0"/>
+          <w:tblHeader w:val="0"/>
+        </w:trPr>
+        <w:tc>
+          <w:tcPr>
+            <w:shd w:fill="f5f5f5" w:val="clear"/>
+            <w:tcMar>
+              <w:top w:w="100.0" w:type="dxa"/>
+              <w:left w:w="100.0" w:type="dxa"/>
+              <w:bottom w:w="100.0" w:type="dxa"/>
+              <w:right w:w="100.0" w:type="dxa"/>
+            </w:tcMar>
+            <w:vAlign w:val="top"/>
+          </w:tcPr>
+          <w:p>
+            <w:pPr>
+              <w:keepNext w:val="0"/>
+              <w:keepLines w:val="0"/>
+              <w:pageBreakBefore w:val="0"/>
+              <w:widowControl w:val="0"/>
+              <w:pBdr>
+                <w:top w:space="0" w:sz="0" w:val="nil"/>
+                <w:left w:space="0" w:sz="0" w:val="nil"/>
+                <w:bottom w:space="0" w:sz="0" w:val="nil"/>
+                <w:right w:space="0" w:sz="0" w:val="nil"/>
+                <w:between w:space="0" w:sz="0" w:val="nil"/>
+              </w:pBdr>
+              <w:shd w:fill="auto" w:val="clear"/>
+              <w:spacing w:after="0" w:before="0" w:line="276" w:lineRule="auto"/>
+              <w:ind w:left="0" w:right="0" w:firstLine="0"/>
+              <w:jc w:val="left"/>
+              <w:rPr>
+                <w:rFonts w:ascii="Times New Roman" w:cs="Times New Roman" w:eastAsia="Times New Roman" w:hAnsi="Times New Roman"/>
+                <w:i w:val="0"/>
+                <w:iCs w:val="0"/>
+                <w:sz w:val="20"/>
+                <w:szCs w:val="20"/>
+              </w:rPr>
+            </w:pPr>
+            <w:r>
+              <w:rPr>
+                <w:rtl w:val="0"/>
+              </w:rPr>
+            </w:r>
+          </w:p>
+          <w:p>
+            <w:pPr>
+              <w:keepNext w:val="0"/>
+              <w:keepLines w:val="0"/>
+              <w:pageBreakBefore w:val="0"/>
+              <w:widowControl w:val="0"/>
+              <w:pBdr>
+                <w:top w:space="0" w:sz="0" w:val="nil"/>
+                <w:left w:space="0" w:sz="0" w:val="nil"/>
+                <w:bottom w:space="0" w:sz="0" w:val="nil"/>
+                <w:right w:space="0" w:sz="0" w:val="nil"/>
+                <w:between w:space="0" w:sz="0" w:val="nil"/>
+              </w:pBdr>
+              <w:shd w:fill="auto" w:val="clear"/>
+              <w:spacing w:after="0" w:before="0" w:line="276" w:lineRule="auto"/>
+              <w:ind w:left="0" w:right="0" w:firstLine="0"/>
+              <w:jc w:val="left"/>
+              <w:rPr>
+                <w:rFonts w:ascii="Times New Roman" w:cs="Times New Roman" w:eastAsia="Times New Roman" w:hAnsi="Times New Roman"/>
+                <w:i w:val="0"/>
+                <w:iCs w:val="0"/>
+                <w:sz w:val="20"/>
+                <w:szCs w:val="20"/>
+              </w:rPr>
+            </w:pPr>
+            <w:r>
+              <w:rPr>
+                <w:rtl w:val="0"/>
+              </w:rPr>
+            </w:r>
+          </w:p>
+          <w:p>
+            <w:pPr>
+              <w:keepNext w:val="0"/>
+              <w:keepLines w:val="0"/>
+              <w:pageBreakBefore w:val="0"/>
+              <w:widowControl w:val="0"/>
+              <w:pBdr>
+                <w:top w:space="0" w:sz="0" w:val="nil"/>
+                <w:left w:space="0" w:sz="0" w:val="nil"/>
+                <w:bottom w:space="0" w:sz="0" w:val="nil"/>
+                <w:right w:space="0" w:sz="0" w:val="nil"/>
+                <w:between w:space="0" w:sz="0" w:val="nil"/>
+              </w:pBdr>
+              <w:shd w:fill="auto" w:val="clear"/>
+              <w:spacing w:after="0" w:before="0" w:line="276" w:lineRule="auto"/>
+              <w:ind w:left="0" w:right="0" w:firstLine="0"/>
+              <w:jc w:val="left"/>
+              <w:rPr>
+                <w:rFonts w:ascii="Times New Roman" w:cs="Times New Roman" w:eastAsia="Times New Roman" w:hAnsi="Times New Roman"/>
+                <w:i w:val="0"/>
+                <w:iCs w:val="0"/>
+                <w:sz w:val="20"/>
+                <w:szCs w:val="20"/>
+              </w:rPr>
+            </w:pPr>
+            <w:r>
+              <w:rPr>
+                <w:rtl w:val="0"/>
+              </w:rPr>
+            </w:r>
+          </w:p>
+          <w:p>
+            <w:pPr>
+              <w:keepNext w:val="0"/>
+              <w:keepLines w:val="0"/>
+              <w:pageBreakBefore w:val="0"/>
+              <w:widowControl w:val="0"/>
+              <w:pBdr>
+                <w:top w:space="0" w:sz="0" w:val="nil"/>
+                <w:left w:space="0" w:sz="0" w:val="nil"/>
+                <w:bottom w:space="0" w:sz="0" w:val="nil"/>
+                <w:right w:space="0" w:sz="0" w:val="nil"/>
+                <w:between w:space="0" w:sz="0" w:val="nil"/>
+              </w:pBdr>
+              <w:shd w:fill="auto" w:val="clear"/>
+              <w:spacing w:after="0" w:before="0" w:line="276" w:lineRule="auto"/>
+              <w:ind w:left="0" w:right="0" w:firstLine="0"/>
+              <w:jc w:val="left"/>
+              <w:rPr>
+                <w:rFonts w:ascii="Times New Roman" w:cs="Times New Roman" w:eastAsia="Times New Roman" w:hAnsi="Times New Roman"/>
+                <w:i w:val="0"/>
+                <w:iCs w:val="0"/>
+                <w:sz w:val="20"/>
+                <w:szCs w:val="20"/>
+              </w:rPr>
+            </w:pPr>
+            <w:r>
+              <w:rPr>
+                <w:rFonts w:ascii="Times New Roman" w:cs="Times New Roman" w:eastAsia="Times New Roman" w:hAnsi="Times New Roman"/>
+                <w:sz w:val="20"/>
+                <w:szCs w:val="20"/>
+              </w:rPr>
+              <w:drawing>
+                <wp:inline distB="114300" distT="114300" distL="114300" distR="114300">
+                  <wp:extent cx="5334000" cy="3718724"/>
+                  <wp:effectExtent b="0" l="0" r="0" t="0"/>
+                  <wp:docPr id="5" name="image5.png"/>
+                  <a:graphic>
+                    <a:graphicData uri="http://schemas.openxmlformats.org/drawingml/2006/picture">
+                      <pic:pic>
+                        <pic:nvPicPr>
+                          <pic:cNvPr id="0" name="image5.png"/>
                           <pic:cNvPicPr preferRelativeResize="0"/>
                         </pic:nvPicPr>
                         <pic:blipFill>
@@ -10043,8 +10972,8 @@
           <w:szCs w:val="28"/>
         </w:rPr>
       </w:pPr>
-      <w:bookmarkStart w:colFirst="0" w:colLast="0" w:name="_dou9kvdnltcd" w:id="26"/>
-      <w:bookmarkEnd w:id="26"/>
+      <w:bookmarkStart w:colFirst="0" w:colLast="0" w:name="_dou9kvdnltcd" w:id="27"/>
+      <w:bookmarkEnd w:id="27"/>
       <w:r>
         <w:rPr>
           <w:rFonts w:ascii="Times New Roman" w:cs="Times New Roman" w:eastAsia="Times New Roman" w:hAnsi="Times New Roman"/>
@@ -10077,8 +11006,8 @@
           <w:szCs w:val="24"/>
         </w:rPr>
       </w:pPr>
-      <w:bookmarkStart w:colFirst="0" w:colLast="0" w:name="_3rm8mjqptp34" w:id="27"/>
-      <w:bookmarkEnd w:id="27"/>
+      <w:bookmarkStart w:colFirst="0" w:colLast="0" w:name="_3rm8mjqptp34" w:id="28"/>
+      <w:bookmarkEnd w:id="28"/>
       <w:r>
         <w:rPr>
           <w:rFonts w:ascii="Times New Roman" w:cs="Times New Roman" w:eastAsia="Times New Roman" w:hAnsi="Times New Roman"/>
@@ -10210,8 +11139,8 @@
           <w:szCs w:val="24"/>
         </w:rPr>
       </w:pPr>
-      <w:bookmarkStart w:colFirst="0" w:colLast="0" w:name="_wu0vh6k88sb7" w:id="28"/>
-      <w:bookmarkEnd w:id="28"/>
+      <w:bookmarkStart w:colFirst="0" w:colLast="0" w:name="_wu0vh6k88sb7" w:id="29"/>
+      <w:bookmarkEnd w:id="29"/>
       <w:r>
         <w:rPr>
           <w:rFonts w:ascii="Times New Roman" w:cs="Times New Roman" w:eastAsia="Times New Roman" w:hAnsi="Times New Roman"/>
@@ -10224,7 +11153,7 @@
     </w:p>
     <w:tbl>
       <w:tblPr>
-        <w:tblStyle w:val="Table10"/>
+        <w:tblStyle w:val="Table11"/>
         <w:jc w:val="left"/>
         <w:tblBorders>
           <w:top w:color="000000" w:space="0" w:sz="8" w:val="single"/>
@@ -11407,8 +12336,8 @@
           <w:szCs w:val="28"/>
         </w:rPr>
       </w:pPr>
-      <w:bookmarkStart w:colFirst="0" w:colLast="0" w:name="_ucf1prx01qsu" w:id="29"/>
-      <w:bookmarkEnd w:id="29"/>
+      <w:bookmarkStart w:colFirst="0" w:colLast="0" w:name="_ucf1prx01qsu" w:id="30"/>
+      <w:bookmarkEnd w:id="30"/>
       <w:r>
         <w:rPr>
           <w:rFonts w:ascii="Times New Roman" w:cs="Times New Roman" w:eastAsia="Times New Roman" w:hAnsi="Times New Roman"/>
@@ -11539,7 +12468,7 @@
     </w:p>
     <w:tbl>
       <w:tblPr>
-        <w:tblStyle w:val="Table11"/>
+        <w:tblStyle w:val="Table12"/>
         <w:jc w:val="left"/>
         <w:tblBorders>
           <w:top w:color="000000" w:space="0" w:sz="8" w:val="single"/>
@@ -11704,12 +12633,12 @@
                 <wp:inline distB="114300" distT="114300" distL="114300" distR="114300">
                   <wp:extent cx="5078745" cy="4508500"/>
                   <wp:effectExtent b="0" l="0" r="0" t="0"/>
-                  <wp:docPr id="6" name="image5.png"/>
+                  <wp:docPr id="6" name="image6.png"/>
                   <a:graphic>
                     <a:graphicData uri="http://schemas.openxmlformats.org/drawingml/2006/picture">
                       <pic:pic>
                         <pic:nvPicPr>
-                          <pic:cNvPr id="0" name="image5.png"/>
+                          <pic:cNvPr id="0" name="image6.png"/>
                           <pic:cNvPicPr preferRelativeResize="0"/>
                         </pic:nvPicPr>
                         <pic:blipFill>
@@ -11913,8 +12842,8 @@
           <w:szCs w:val="28"/>
         </w:rPr>
       </w:pPr>
-      <w:bookmarkStart w:colFirst="0" w:colLast="0" w:name="_6a5lb5sl9h65" w:id="30"/>
-      <w:bookmarkEnd w:id="30"/>
+      <w:bookmarkStart w:colFirst="0" w:colLast="0" w:name="_6a5lb5sl9h65" w:id="31"/>
+      <w:bookmarkEnd w:id="31"/>
       <w:r>
         <w:rPr>
           <w:rFonts w:ascii="Times New Roman" w:cs="Times New Roman" w:eastAsia="Times New Roman" w:hAnsi="Times New Roman"/>
@@ -11967,7 +12896,7 @@
     </w:p>
     <w:tbl>
       <w:tblPr>
-        <w:tblStyle w:val="Table12"/>
+        <w:tblStyle w:val="Table13"/>
         <w:jc w:val="left"/>
         <w:tblBorders>
           <w:top w:color="000000" w:space="0" w:sz="8" w:val="single"/>
@@ -15261,410 +16190,6 @@
     </w:p>
     <w:tbl>
       <w:tblPr>
-        <w:tblStyle w:val="Table13"/>
-        <w:jc w:val="left"/>
-        <w:tblBorders>
-          <w:top w:color="000000" w:space="0" w:sz="8" w:val="single"/>
-          <w:left w:color="000000" w:space="0" w:sz="8" w:val="single"/>
-          <w:bottom w:color="000000" w:space="0" w:sz="8" w:val="single"/>
-          <w:right w:color="000000" w:space="0" w:sz="8" w:val="single"/>
-          <w:insideH w:color="000000" w:space="0" w:sz="8" w:val="single"/>
-          <w:insideV w:color="000000" w:space="0" w:sz="8" w:val="single"/>
-        </w:tblBorders>
-        <w:tblLayout w:type="fixed"/>
-        <w:tblLook w:val="0600"/>
-      </w:tblPr>
-      <w:tblGrid>
-        <w:gridCol w:w="9029"/>
-        <w:tblGridChange w:id="0">
-          <w:tblGrid>
-            <w:gridCol w:w="9029"/>
-          </w:tblGrid>
-        </w:tblGridChange>
-      </w:tblGrid>
-      <w:tr>
-        <w:trPr>
-          <w:cantSplit w:val="0"/>
-          <w:tblHeader w:val="0"/>
-        </w:trPr>
-        <w:tc>
-          <w:tcPr>
-            <w:shd w:fill="f5f5f5" w:val="clear"/>
-            <w:tcMar>
-              <w:top w:w="100.0" w:type="dxa"/>
-              <w:left w:w="100.0" w:type="dxa"/>
-              <w:bottom w:w="100.0" w:type="dxa"/>
-              <w:right w:w="100.0" w:type="dxa"/>
-            </w:tcMar>
-            <w:vAlign w:val="top"/>
-          </w:tcPr>
-          <w:p>
-            <w:pPr>
-              <w:keepNext w:val="0"/>
-              <w:keepLines w:val="0"/>
-              <w:pageBreakBefore w:val="0"/>
-              <w:widowControl w:val="0"/>
-              <w:pBdr>
-                <w:top w:space="0" w:sz="0" w:val="nil"/>
-                <w:left w:space="0" w:sz="0" w:val="nil"/>
-                <w:bottom w:space="0" w:sz="0" w:val="nil"/>
-                <w:right w:space="0" w:sz="0" w:val="nil"/>
-                <w:between w:space="0" w:sz="0" w:val="nil"/>
-              </w:pBdr>
-              <w:shd w:fill="auto" w:val="clear"/>
-              <w:spacing w:after="0" w:before="0" w:line="276" w:lineRule="auto"/>
-              <w:ind w:left="0" w:right="0" w:firstLine="0"/>
-              <w:jc w:val="left"/>
-              <w:rPr>
-                <w:rFonts w:ascii="Times New Roman" w:cs="Times New Roman" w:eastAsia="Times New Roman" w:hAnsi="Times New Roman"/>
-                <w:i w:val="0"/>
-                <w:iCs w:val="0"/>
-                <w:sz w:val="20"/>
-                <w:szCs w:val="20"/>
-              </w:rPr>
-            </w:pPr>
-            <w:r>
-              <w:rPr>
-                <w:rtl w:val="0"/>
-              </w:rPr>
-            </w:r>
-          </w:p>
-          <w:p>
-            <w:pPr>
-              <w:keepNext w:val="0"/>
-              <w:keepLines w:val="0"/>
-              <w:pageBreakBefore w:val="0"/>
-              <w:widowControl w:val="0"/>
-              <w:pBdr>
-                <w:top w:space="0" w:sz="0" w:val="nil"/>
-                <w:left w:space="0" w:sz="0" w:val="nil"/>
-                <w:bottom w:space="0" w:sz="0" w:val="nil"/>
-                <w:right w:space="0" w:sz="0" w:val="nil"/>
-                <w:between w:space="0" w:sz="0" w:val="nil"/>
-              </w:pBdr>
-              <w:shd w:fill="auto" w:val="clear"/>
-              <w:spacing w:after="0" w:before="0" w:line="276" w:lineRule="auto"/>
-              <w:ind w:left="0" w:right="0" w:firstLine="0"/>
-              <w:jc w:val="left"/>
-              <w:rPr>
-                <w:rFonts w:ascii="Times New Roman" w:cs="Times New Roman" w:eastAsia="Times New Roman" w:hAnsi="Times New Roman"/>
-                <w:i w:val="0"/>
-                <w:iCs w:val="0"/>
-                <w:sz w:val="20"/>
-                <w:szCs w:val="20"/>
-              </w:rPr>
-            </w:pPr>
-            <w:r>
-              <w:rPr>
-                <w:rtl w:val="0"/>
-              </w:rPr>
-            </w:r>
-          </w:p>
-          <w:p>
-            <w:pPr>
-              <w:keepNext w:val="0"/>
-              <w:keepLines w:val="0"/>
-              <w:pageBreakBefore w:val="0"/>
-              <w:widowControl w:val="0"/>
-              <w:pBdr>
-                <w:top w:space="0" w:sz="0" w:val="nil"/>
-                <w:left w:space="0" w:sz="0" w:val="nil"/>
-                <w:bottom w:space="0" w:sz="0" w:val="nil"/>
-                <w:right w:space="0" w:sz="0" w:val="nil"/>
-                <w:between w:space="0" w:sz="0" w:val="nil"/>
-              </w:pBdr>
-              <w:shd w:fill="auto" w:val="clear"/>
-              <w:spacing w:after="0" w:before="0" w:line="276" w:lineRule="auto"/>
-              <w:ind w:left="0" w:right="0" w:firstLine="0"/>
-              <w:jc w:val="left"/>
-              <w:rPr>
-                <w:rFonts w:ascii="Times New Roman" w:cs="Times New Roman" w:eastAsia="Times New Roman" w:hAnsi="Times New Roman"/>
-                <w:i w:val="0"/>
-                <w:iCs w:val="0"/>
-                <w:sz w:val="20"/>
-                <w:szCs w:val="20"/>
-              </w:rPr>
-            </w:pPr>
-            <w:r>
-              <w:rPr>
-                <w:rtl w:val="0"/>
-              </w:rPr>
-            </w:r>
-          </w:p>
-          <w:p>
-            <w:pPr>
-              <w:keepNext w:val="0"/>
-              <w:keepLines w:val="0"/>
-              <w:pageBreakBefore w:val="0"/>
-              <w:widowControl w:val="0"/>
-              <w:pBdr>
-                <w:top w:space="0" w:sz="0" w:val="nil"/>
-                <w:left w:space="0" w:sz="0" w:val="nil"/>
-                <w:bottom w:space="0" w:sz="0" w:val="nil"/>
-                <w:right w:space="0" w:sz="0" w:val="nil"/>
-                <w:between w:space="0" w:sz="0" w:val="nil"/>
-              </w:pBdr>
-              <w:shd w:fill="auto" w:val="clear"/>
-              <w:spacing w:after="0" w:before="0" w:line="276" w:lineRule="auto"/>
-              <w:ind w:left="0" w:right="0" w:firstLine="0"/>
-              <w:jc w:val="left"/>
-              <w:rPr>
-                <w:rFonts w:ascii="Times New Roman" w:cs="Times New Roman" w:eastAsia="Times New Roman" w:hAnsi="Times New Roman"/>
-                <w:i w:val="0"/>
-                <w:iCs w:val="0"/>
-                <w:sz w:val="20"/>
-                <w:szCs w:val="20"/>
-              </w:rPr>
-            </w:pPr>
-            <w:r>
-              <w:rPr>
-                <w:rFonts w:ascii="Times New Roman" w:cs="Times New Roman" w:eastAsia="Times New Roman" w:hAnsi="Times New Roman"/>
-                <w:sz w:val="20"/>
-                <w:szCs w:val="20"/>
-              </w:rPr>
-              <w:drawing>
-                <wp:inline distB="114300" distT="114300" distL="114300" distR="114300">
-                  <wp:extent cx="5706094" cy="2362200"/>
-                  <wp:effectExtent b="0" l="0" r="0" t="0"/>
-                  <wp:docPr id="7" name="image3.png"/>
-                  <a:graphic>
-                    <a:graphicData uri="http://schemas.openxmlformats.org/drawingml/2006/picture">
-                      <pic:pic>
-                        <pic:nvPicPr>
-                          <pic:cNvPr id="0" name="image3.png"/>
-                          <pic:cNvPicPr preferRelativeResize="0"/>
-                        </pic:nvPicPr>
-                        <pic:blipFill>
-                          <a:blip r:embed="rId13"/>
-                          <a:srcRect b="0" l="0" r="0" t="0"/>
-                          <a:stretch>
-                            <a:fillRect/>
-                          </a:stretch>
-                        </pic:blipFill>
-                        <pic:spPr>
-                          <a:xfrm>
-                            <a:off x="0" y="0"/>
-                            <a:ext cx="5706094" cy="2362200"/>
-                          </a:xfrm>
-                          <a:prstGeom prst="rect"/>
-                          <a:ln/>
-                        </pic:spPr>
-                      </pic:pic>
-                    </a:graphicData>
-                  </a:graphic>
-                </wp:inline>
-              </w:drawing>
-            </w:r>
-            <w:r>
-              <w:rPr>
-                <w:rtl w:val="0"/>
-              </w:rPr>
-            </w:r>
-          </w:p>
-          <w:p>
-            <w:pPr>
-              <w:keepNext w:val="0"/>
-              <w:keepLines w:val="0"/>
-              <w:pageBreakBefore w:val="0"/>
-              <w:widowControl w:val="0"/>
-              <w:pBdr>
-                <w:top w:space="0" w:sz="0" w:val="nil"/>
-                <w:left w:space="0" w:sz="0" w:val="nil"/>
-                <w:bottom w:space="0" w:sz="0" w:val="nil"/>
-                <w:right w:space="0" w:sz="0" w:val="nil"/>
-                <w:between w:space="0" w:sz="0" w:val="nil"/>
-              </w:pBdr>
-              <w:shd w:fill="auto" w:val="clear"/>
-              <w:spacing w:after="0" w:before="0" w:line="276" w:lineRule="auto"/>
-              <w:ind w:left="0" w:right="0" w:firstLine="0"/>
-              <w:jc w:val="left"/>
-              <w:rPr>
-                <w:rFonts w:ascii="Times New Roman" w:cs="Times New Roman" w:eastAsia="Times New Roman" w:hAnsi="Times New Roman"/>
-                <w:i w:val="0"/>
-                <w:iCs w:val="0"/>
-                <w:sz w:val="20"/>
-                <w:szCs w:val="20"/>
-              </w:rPr>
-            </w:pPr>
-            <w:r>
-              <w:rPr>
-                <w:rtl w:val="0"/>
-              </w:rPr>
-            </w:r>
-          </w:p>
-          <w:p>
-            <w:pPr>
-              <w:keepNext w:val="0"/>
-              <w:keepLines w:val="0"/>
-              <w:pageBreakBefore w:val="0"/>
-              <w:widowControl w:val="0"/>
-              <w:pBdr>
-                <w:top w:space="0" w:sz="0" w:val="nil"/>
-                <w:left w:space="0" w:sz="0" w:val="nil"/>
-                <w:bottom w:space="0" w:sz="0" w:val="nil"/>
-                <w:right w:space="0" w:sz="0" w:val="nil"/>
-                <w:between w:space="0" w:sz="0" w:val="nil"/>
-              </w:pBdr>
-              <w:shd w:fill="auto" w:val="clear"/>
-              <w:spacing w:after="0" w:before="0" w:line="276" w:lineRule="auto"/>
-              <w:ind w:left="0" w:right="0" w:firstLine="0"/>
-              <w:jc w:val="left"/>
-              <w:rPr>
-                <w:rFonts w:ascii="Times New Roman" w:cs="Times New Roman" w:eastAsia="Times New Roman" w:hAnsi="Times New Roman"/>
-                <w:i w:val="0"/>
-                <w:iCs w:val="0"/>
-                <w:sz w:val="20"/>
-                <w:szCs w:val="20"/>
-              </w:rPr>
-            </w:pPr>
-            <w:r>
-              <w:rPr>
-                <w:rtl w:val="0"/>
-              </w:rPr>
-            </w:r>
-          </w:p>
-          <w:p>
-            <w:pPr>
-              <w:keepNext w:val="0"/>
-              <w:keepLines w:val="0"/>
-              <w:pageBreakBefore w:val="0"/>
-              <w:widowControl w:val="0"/>
-              <w:pBdr>
-                <w:top w:space="0" w:sz="0" w:val="nil"/>
-                <w:left w:space="0" w:sz="0" w:val="nil"/>
-                <w:bottom w:space="0" w:sz="0" w:val="nil"/>
-                <w:right w:space="0" w:sz="0" w:val="nil"/>
-                <w:between w:space="0" w:sz="0" w:val="nil"/>
-              </w:pBdr>
-              <w:shd w:fill="auto" w:val="clear"/>
-              <w:spacing w:after="0" w:before="0" w:line="276" w:lineRule="auto"/>
-              <w:ind w:left="0" w:right="0" w:firstLine="0"/>
-              <w:jc w:val="left"/>
-              <w:rPr>
-                <w:rFonts w:ascii="Times New Roman" w:cs="Times New Roman" w:eastAsia="Times New Roman" w:hAnsi="Times New Roman"/>
-                <w:i w:val="0"/>
-                <w:iCs w:val="0"/>
-                <w:sz w:val="20"/>
-                <w:szCs w:val="20"/>
-              </w:rPr>
-            </w:pPr>
-            <w:r>
-              <w:rPr>
-                <w:rtl w:val="0"/>
-              </w:rPr>
-            </w:r>
-          </w:p>
-        </w:tc>
-      </w:tr>
-    </w:tbl>
-    <w:p>
-      <w:pPr>
-        <w:keepNext w:val="0"/>
-        <w:keepLines w:val="0"/>
-        <w:pageBreakBefore w:val="0"/>
-        <w:widowControl w:val="0"/>
-        <w:pBdr>
-          <w:top w:space="0" w:sz="0" w:val="nil"/>
-          <w:left w:space="0" w:sz="0" w:val="nil"/>
-          <w:bottom w:space="0" w:sz="0" w:val="nil"/>
-          <w:right w:space="0" w:sz="0" w:val="nil"/>
-          <w:between w:space="0" w:sz="0" w:val="nil"/>
-        </w:pBdr>
-        <w:shd w:fill="auto" w:val="clear"/>
-        <w:spacing w:after="0" w:before="0" w:line="276" w:lineRule="auto"/>
-        <w:ind w:left="0" w:right="0" w:firstLine="0"/>
-        <w:jc w:val="left"/>
-        <w:rPr>
-          <w:rFonts w:ascii="Times New Roman" w:cs="Times New Roman" w:eastAsia="Times New Roman" w:hAnsi="Times New Roman"/>
-          <w:i w:val="0"/>
-          <w:iCs w:val="0"/>
-          <w:sz w:val="22"/>
-          <w:szCs w:val="22"/>
-        </w:rPr>
-      </w:pPr>
-      <w:r>
-        <w:rPr>
-          <w:rtl w:val="0"/>
-        </w:rPr>
-      </w:r>
-    </w:p>
-    <w:p>
-      <w:pPr>
-        <w:keepNext w:val="0"/>
-        <w:keepLines w:val="0"/>
-        <w:pageBreakBefore w:val="0"/>
-        <w:widowControl w:val="0"/>
-        <w:pBdr>
-          <w:top w:space="0" w:sz="0" w:val="nil"/>
-          <w:left w:space="0" w:sz="0" w:val="nil"/>
-          <w:bottom w:space="0" w:sz="0" w:val="nil"/>
-          <w:right w:space="0" w:sz="0" w:val="nil"/>
-          <w:between w:space="0" w:sz="0" w:val="nil"/>
-        </w:pBdr>
-        <w:shd w:fill="auto" w:val="clear"/>
-        <w:spacing w:after="200" w:before="0" w:line="360" w:lineRule="auto"/>
-        <w:ind w:left="0" w:right="0" w:firstLine="0"/>
-        <w:jc w:val="both"/>
-        <w:rPr>
-          <w:rFonts w:ascii="Times New Roman" w:cs="Times New Roman" w:eastAsia="Times New Roman" w:hAnsi="Times New Roman"/>
-          <w:i w:val="1"/>
-          <w:iCs w:val="1"/>
-          <w:sz w:val="20"/>
-          <w:szCs w:val="20"/>
-        </w:rPr>
-      </w:pPr>
-      <w:r>
-        <w:rPr>
-          <w:rFonts w:ascii="Times New Roman" w:cs="Times New Roman" w:eastAsia="Times New Roman" w:hAnsi="Times New Roman"/>
-          <w:i w:val="1"/>
-          <w:iCs w:val="1"/>
-          <w:sz w:val="20"/>
-          <w:szCs w:val="20"/>
-          <w:rtl w:val="0"/>
-        </w:rPr>
-        <w:t xml:space="preserve">Nota. Evidencia obtenida durante el desarrollo de la Etapa 1.</w:t>
-      </w:r>
-    </w:p>
-    <w:p>
-      <w:pPr>
-        <w:keepNext w:val="0"/>
-        <w:keepLines w:val="0"/>
-        <w:pageBreakBefore w:val="0"/>
-        <w:widowControl w:val="0"/>
-        <w:pBdr>
-          <w:top w:space="0" w:sz="0" w:val="nil"/>
-          <w:left w:space="0" w:sz="0" w:val="nil"/>
-          <w:bottom w:space="0" w:sz="0" w:val="nil"/>
-          <w:right w:space="0" w:sz="0" w:val="nil"/>
-          <w:between w:space="0" w:sz="0" w:val="nil"/>
-        </w:pBdr>
-        <w:shd w:fill="auto" w:val="clear"/>
-        <w:spacing w:after="80" w:before="200" w:line="360" w:lineRule="auto"/>
-        <w:ind w:left="0" w:right="0" w:firstLine="0"/>
-        <w:jc w:val="both"/>
-        <w:rPr>
-          <w:rFonts w:ascii="Times New Roman" w:cs="Times New Roman" w:eastAsia="Times New Roman" w:hAnsi="Times New Roman"/>
-          <w:i w:val="0"/>
-          <w:iCs w:val="0"/>
-          <w:sz w:val="22"/>
-          <w:szCs w:val="22"/>
-        </w:rPr>
-      </w:pPr>
-      <w:r>
-        <w:rPr>
-          <w:rFonts w:ascii="Times New Roman" w:cs="Times New Roman" w:eastAsia="Times New Roman" w:hAnsi="Times New Roman"/>
-          <w:rtl w:val="0"/>
-        </w:rPr>
-        <w:t xml:space="preserve">Figura 9. Validación de la salida activa F = 1 para la combinación A = 1, B = 0, C = 0.</w:t>
-      </w:r>
-      <w:r>
-        <w:rPr>
-          <w:rtl w:val="0"/>
-        </w:rPr>
-      </w:r>
-    </w:p>
-    <w:tbl>
-      <w:tblPr>
         <w:tblStyle w:val="Table14"/>
         <w:jc w:val="left"/>
         <w:tblBorders>
@@ -15828,14 +16353,418 @@
               </w:rPr>
               <w:drawing>
                 <wp:inline distB="114300" distT="114300" distL="114300" distR="114300">
-                  <wp:extent cx="5715000" cy="2231199"/>
+                  <wp:extent cx="5706094" cy="2362200"/>
                   <wp:effectExtent b="0" l="0" r="0" t="0"/>
-                  <wp:docPr id="4" name="image6.png"/>
+                  <wp:docPr id="7" name="image1.png"/>
                   <a:graphic>
                     <a:graphicData uri="http://schemas.openxmlformats.org/drawingml/2006/picture">
                       <pic:pic>
                         <pic:nvPicPr>
-                          <pic:cNvPr id="0" name="image6.png"/>
+                          <pic:cNvPr id="0" name="image1.png"/>
+                          <pic:cNvPicPr preferRelativeResize="0"/>
+                        </pic:nvPicPr>
+                        <pic:blipFill>
+                          <a:blip r:embed="rId13"/>
+                          <a:srcRect b="0" l="0" r="0" t="0"/>
+                          <a:stretch>
+                            <a:fillRect/>
+                          </a:stretch>
+                        </pic:blipFill>
+                        <pic:spPr>
+                          <a:xfrm>
+                            <a:off x="0" y="0"/>
+                            <a:ext cx="5706094" cy="2362200"/>
+                          </a:xfrm>
+                          <a:prstGeom prst="rect"/>
+                          <a:ln/>
+                        </pic:spPr>
+                      </pic:pic>
+                    </a:graphicData>
+                  </a:graphic>
+                </wp:inline>
+              </w:drawing>
+            </w:r>
+            <w:r>
+              <w:rPr>
+                <w:rtl w:val="0"/>
+              </w:rPr>
+            </w:r>
+          </w:p>
+          <w:p>
+            <w:pPr>
+              <w:keepNext w:val="0"/>
+              <w:keepLines w:val="0"/>
+              <w:pageBreakBefore w:val="0"/>
+              <w:widowControl w:val="0"/>
+              <w:pBdr>
+                <w:top w:space="0" w:sz="0" w:val="nil"/>
+                <w:left w:space="0" w:sz="0" w:val="nil"/>
+                <w:bottom w:space="0" w:sz="0" w:val="nil"/>
+                <w:right w:space="0" w:sz="0" w:val="nil"/>
+                <w:between w:space="0" w:sz="0" w:val="nil"/>
+              </w:pBdr>
+              <w:shd w:fill="auto" w:val="clear"/>
+              <w:spacing w:after="0" w:before="0" w:line="276" w:lineRule="auto"/>
+              <w:ind w:left="0" w:right="0" w:firstLine="0"/>
+              <w:jc w:val="left"/>
+              <w:rPr>
+                <w:rFonts w:ascii="Times New Roman" w:cs="Times New Roman" w:eastAsia="Times New Roman" w:hAnsi="Times New Roman"/>
+                <w:i w:val="0"/>
+                <w:iCs w:val="0"/>
+                <w:sz w:val="20"/>
+                <w:szCs w:val="20"/>
+              </w:rPr>
+            </w:pPr>
+            <w:r>
+              <w:rPr>
+                <w:rtl w:val="0"/>
+              </w:rPr>
+            </w:r>
+          </w:p>
+          <w:p>
+            <w:pPr>
+              <w:keepNext w:val="0"/>
+              <w:keepLines w:val="0"/>
+              <w:pageBreakBefore w:val="0"/>
+              <w:widowControl w:val="0"/>
+              <w:pBdr>
+                <w:top w:space="0" w:sz="0" w:val="nil"/>
+                <w:left w:space="0" w:sz="0" w:val="nil"/>
+                <w:bottom w:space="0" w:sz="0" w:val="nil"/>
+                <w:right w:space="0" w:sz="0" w:val="nil"/>
+                <w:between w:space="0" w:sz="0" w:val="nil"/>
+              </w:pBdr>
+              <w:shd w:fill="auto" w:val="clear"/>
+              <w:spacing w:after="0" w:before="0" w:line="276" w:lineRule="auto"/>
+              <w:ind w:left="0" w:right="0" w:firstLine="0"/>
+              <w:jc w:val="left"/>
+              <w:rPr>
+                <w:rFonts w:ascii="Times New Roman" w:cs="Times New Roman" w:eastAsia="Times New Roman" w:hAnsi="Times New Roman"/>
+                <w:i w:val="0"/>
+                <w:iCs w:val="0"/>
+                <w:sz w:val="20"/>
+                <w:szCs w:val="20"/>
+              </w:rPr>
+            </w:pPr>
+            <w:r>
+              <w:rPr>
+                <w:rtl w:val="0"/>
+              </w:rPr>
+            </w:r>
+          </w:p>
+          <w:p>
+            <w:pPr>
+              <w:keepNext w:val="0"/>
+              <w:keepLines w:val="0"/>
+              <w:pageBreakBefore w:val="0"/>
+              <w:widowControl w:val="0"/>
+              <w:pBdr>
+                <w:top w:space="0" w:sz="0" w:val="nil"/>
+                <w:left w:space="0" w:sz="0" w:val="nil"/>
+                <w:bottom w:space="0" w:sz="0" w:val="nil"/>
+                <w:right w:space="0" w:sz="0" w:val="nil"/>
+                <w:between w:space="0" w:sz="0" w:val="nil"/>
+              </w:pBdr>
+              <w:shd w:fill="auto" w:val="clear"/>
+              <w:spacing w:after="0" w:before="0" w:line="276" w:lineRule="auto"/>
+              <w:ind w:left="0" w:right="0" w:firstLine="0"/>
+              <w:jc w:val="left"/>
+              <w:rPr>
+                <w:rFonts w:ascii="Times New Roman" w:cs="Times New Roman" w:eastAsia="Times New Roman" w:hAnsi="Times New Roman"/>
+                <w:i w:val="0"/>
+                <w:iCs w:val="0"/>
+                <w:sz w:val="20"/>
+                <w:szCs w:val="20"/>
+              </w:rPr>
+            </w:pPr>
+            <w:r>
+              <w:rPr>
+                <w:rtl w:val="0"/>
+              </w:rPr>
+            </w:r>
+          </w:p>
+        </w:tc>
+      </w:tr>
+    </w:tbl>
+    <w:p>
+      <w:pPr>
+        <w:keepNext w:val="0"/>
+        <w:keepLines w:val="0"/>
+        <w:pageBreakBefore w:val="0"/>
+        <w:widowControl w:val="0"/>
+        <w:pBdr>
+          <w:top w:space="0" w:sz="0" w:val="nil"/>
+          <w:left w:space="0" w:sz="0" w:val="nil"/>
+          <w:bottom w:space="0" w:sz="0" w:val="nil"/>
+          <w:right w:space="0" w:sz="0" w:val="nil"/>
+          <w:between w:space="0" w:sz="0" w:val="nil"/>
+        </w:pBdr>
+        <w:shd w:fill="auto" w:val="clear"/>
+        <w:spacing w:after="0" w:before="0" w:line="276" w:lineRule="auto"/>
+        <w:ind w:left="0" w:right="0" w:firstLine="0"/>
+        <w:jc w:val="left"/>
+        <w:rPr>
+          <w:rFonts w:ascii="Times New Roman" w:cs="Times New Roman" w:eastAsia="Times New Roman" w:hAnsi="Times New Roman"/>
+          <w:i w:val="0"/>
+          <w:iCs w:val="0"/>
+          <w:sz w:val="22"/>
+          <w:szCs w:val="22"/>
+        </w:rPr>
+      </w:pPr>
+      <w:r>
+        <w:rPr>
+          <w:rtl w:val="0"/>
+        </w:rPr>
+      </w:r>
+    </w:p>
+    <w:p>
+      <w:pPr>
+        <w:keepNext w:val="0"/>
+        <w:keepLines w:val="0"/>
+        <w:pageBreakBefore w:val="0"/>
+        <w:widowControl w:val="0"/>
+        <w:pBdr>
+          <w:top w:space="0" w:sz="0" w:val="nil"/>
+          <w:left w:space="0" w:sz="0" w:val="nil"/>
+          <w:bottom w:space="0" w:sz="0" w:val="nil"/>
+          <w:right w:space="0" w:sz="0" w:val="nil"/>
+          <w:between w:space="0" w:sz="0" w:val="nil"/>
+        </w:pBdr>
+        <w:shd w:fill="auto" w:val="clear"/>
+        <w:spacing w:after="200" w:before="0" w:line="360" w:lineRule="auto"/>
+        <w:ind w:left="0" w:right="0" w:firstLine="0"/>
+        <w:jc w:val="both"/>
+        <w:rPr>
+          <w:rFonts w:ascii="Times New Roman" w:cs="Times New Roman" w:eastAsia="Times New Roman" w:hAnsi="Times New Roman"/>
+          <w:i w:val="1"/>
+          <w:iCs w:val="1"/>
+          <w:sz w:val="20"/>
+          <w:szCs w:val="20"/>
+        </w:rPr>
+      </w:pPr>
+      <w:r>
+        <w:rPr>
+          <w:rFonts w:ascii="Times New Roman" w:cs="Times New Roman" w:eastAsia="Times New Roman" w:hAnsi="Times New Roman"/>
+          <w:i w:val="1"/>
+          <w:iCs w:val="1"/>
+          <w:sz w:val="20"/>
+          <w:szCs w:val="20"/>
+          <w:rtl w:val="0"/>
+        </w:rPr>
+        <w:t xml:space="preserve">Nota. Evidencia obtenida durante el desarrollo de la Etapa 1.</w:t>
+      </w:r>
+    </w:p>
+    <w:p>
+      <w:pPr>
+        <w:keepNext w:val="0"/>
+        <w:keepLines w:val="0"/>
+        <w:pageBreakBefore w:val="0"/>
+        <w:widowControl w:val="0"/>
+        <w:pBdr>
+          <w:top w:space="0" w:sz="0" w:val="nil"/>
+          <w:left w:space="0" w:sz="0" w:val="nil"/>
+          <w:bottom w:space="0" w:sz="0" w:val="nil"/>
+          <w:right w:space="0" w:sz="0" w:val="nil"/>
+          <w:between w:space="0" w:sz="0" w:val="nil"/>
+        </w:pBdr>
+        <w:shd w:fill="auto" w:val="clear"/>
+        <w:spacing w:after="80" w:before="200" w:line="360" w:lineRule="auto"/>
+        <w:ind w:left="0" w:right="0" w:firstLine="0"/>
+        <w:jc w:val="both"/>
+        <w:rPr>
+          <w:rFonts w:ascii="Times New Roman" w:cs="Times New Roman" w:eastAsia="Times New Roman" w:hAnsi="Times New Roman"/>
+          <w:i w:val="0"/>
+          <w:iCs w:val="0"/>
+          <w:sz w:val="22"/>
+          <w:szCs w:val="22"/>
+        </w:rPr>
+      </w:pPr>
+      <w:r>
+        <w:rPr>
+          <w:rFonts w:ascii="Times New Roman" w:cs="Times New Roman" w:eastAsia="Times New Roman" w:hAnsi="Times New Roman"/>
+          <w:rtl w:val="0"/>
+        </w:rPr>
+        <w:t xml:space="preserve">Figura 9. Validación de la salida activa F = 1 para la combinación A = 1, B = 0, C = 0.</w:t>
+      </w:r>
+      <w:r>
+        <w:rPr>
+          <w:rtl w:val="0"/>
+        </w:rPr>
+      </w:r>
+    </w:p>
+    <w:tbl>
+      <w:tblPr>
+        <w:tblStyle w:val="Table15"/>
+        <w:jc w:val="left"/>
+        <w:tblBorders>
+          <w:top w:color="000000" w:space="0" w:sz="8" w:val="single"/>
+          <w:left w:color="000000" w:space="0" w:sz="8" w:val="single"/>
+          <w:bottom w:color="000000" w:space="0" w:sz="8" w:val="single"/>
+          <w:right w:color="000000" w:space="0" w:sz="8" w:val="single"/>
+          <w:insideH w:color="000000" w:space="0" w:sz="8" w:val="single"/>
+          <w:insideV w:color="000000" w:space="0" w:sz="8" w:val="single"/>
+        </w:tblBorders>
+        <w:tblLayout w:type="fixed"/>
+        <w:tblLook w:val="0600"/>
+      </w:tblPr>
+      <w:tblGrid>
+        <w:gridCol w:w="9029"/>
+        <w:tblGridChange w:id="0">
+          <w:tblGrid>
+            <w:gridCol w:w="9029"/>
+          </w:tblGrid>
+        </w:tblGridChange>
+      </w:tblGrid>
+      <w:tr>
+        <w:trPr>
+          <w:cantSplit w:val="0"/>
+          <w:tblHeader w:val="0"/>
+        </w:trPr>
+        <w:tc>
+          <w:tcPr>
+            <w:shd w:fill="f5f5f5" w:val="clear"/>
+            <w:tcMar>
+              <w:top w:w="100.0" w:type="dxa"/>
+              <w:left w:w="100.0" w:type="dxa"/>
+              <w:bottom w:w="100.0" w:type="dxa"/>
+              <w:right w:w="100.0" w:type="dxa"/>
+            </w:tcMar>
+            <w:vAlign w:val="top"/>
+          </w:tcPr>
+          <w:p>
+            <w:pPr>
+              <w:keepNext w:val="0"/>
+              <w:keepLines w:val="0"/>
+              <w:pageBreakBefore w:val="0"/>
+              <w:widowControl w:val="0"/>
+              <w:pBdr>
+                <w:top w:space="0" w:sz="0" w:val="nil"/>
+                <w:left w:space="0" w:sz="0" w:val="nil"/>
+                <w:bottom w:space="0" w:sz="0" w:val="nil"/>
+                <w:right w:space="0" w:sz="0" w:val="nil"/>
+                <w:between w:space="0" w:sz="0" w:val="nil"/>
+              </w:pBdr>
+              <w:shd w:fill="auto" w:val="clear"/>
+              <w:spacing w:after="0" w:before="0" w:line="276" w:lineRule="auto"/>
+              <w:ind w:left="0" w:right="0" w:firstLine="0"/>
+              <w:jc w:val="left"/>
+              <w:rPr>
+                <w:rFonts w:ascii="Times New Roman" w:cs="Times New Roman" w:eastAsia="Times New Roman" w:hAnsi="Times New Roman"/>
+                <w:i w:val="0"/>
+                <w:iCs w:val="0"/>
+                <w:sz w:val="20"/>
+                <w:szCs w:val="20"/>
+              </w:rPr>
+            </w:pPr>
+            <w:r>
+              <w:rPr>
+                <w:rtl w:val="0"/>
+              </w:rPr>
+            </w:r>
+          </w:p>
+          <w:p>
+            <w:pPr>
+              <w:keepNext w:val="0"/>
+              <w:keepLines w:val="0"/>
+              <w:pageBreakBefore w:val="0"/>
+              <w:widowControl w:val="0"/>
+              <w:pBdr>
+                <w:top w:space="0" w:sz="0" w:val="nil"/>
+                <w:left w:space="0" w:sz="0" w:val="nil"/>
+                <w:bottom w:space="0" w:sz="0" w:val="nil"/>
+                <w:right w:space="0" w:sz="0" w:val="nil"/>
+                <w:between w:space="0" w:sz="0" w:val="nil"/>
+              </w:pBdr>
+              <w:shd w:fill="auto" w:val="clear"/>
+              <w:spacing w:after="0" w:before="0" w:line="276" w:lineRule="auto"/>
+              <w:ind w:left="0" w:right="0" w:firstLine="0"/>
+              <w:jc w:val="left"/>
+              <w:rPr>
+                <w:rFonts w:ascii="Times New Roman" w:cs="Times New Roman" w:eastAsia="Times New Roman" w:hAnsi="Times New Roman"/>
+                <w:i w:val="0"/>
+                <w:iCs w:val="0"/>
+                <w:sz w:val="20"/>
+                <w:szCs w:val="20"/>
+              </w:rPr>
+            </w:pPr>
+            <w:r>
+              <w:rPr>
+                <w:rtl w:val="0"/>
+              </w:rPr>
+            </w:r>
+          </w:p>
+          <w:p>
+            <w:pPr>
+              <w:keepNext w:val="0"/>
+              <w:keepLines w:val="0"/>
+              <w:pageBreakBefore w:val="0"/>
+              <w:widowControl w:val="0"/>
+              <w:pBdr>
+                <w:top w:space="0" w:sz="0" w:val="nil"/>
+                <w:left w:space="0" w:sz="0" w:val="nil"/>
+                <w:bottom w:space="0" w:sz="0" w:val="nil"/>
+                <w:right w:space="0" w:sz="0" w:val="nil"/>
+                <w:between w:space="0" w:sz="0" w:val="nil"/>
+              </w:pBdr>
+              <w:shd w:fill="auto" w:val="clear"/>
+              <w:spacing w:after="0" w:before="0" w:line="276" w:lineRule="auto"/>
+              <w:ind w:left="0" w:right="0" w:firstLine="0"/>
+              <w:jc w:val="left"/>
+              <w:rPr>
+                <w:rFonts w:ascii="Times New Roman" w:cs="Times New Roman" w:eastAsia="Times New Roman" w:hAnsi="Times New Roman"/>
+                <w:i w:val="0"/>
+                <w:iCs w:val="0"/>
+                <w:sz w:val="20"/>
+                <w:szCs w:val="20"/>
+              </w:rPr>
+            </w:pPr>
+            <w:r>
+              <w:rPr>
+                <w:rtl w:val="0"/>
+              </w:rPr>
+            </w:r>
+          </w:p>
+          <w:p>
+            <w:pPr>
+              <w:keepNext w:val="0"/>
+              <w:keepLines w:val="0"/>
+              <w:pageBreakBefore w:val="0"/>
+              <w:widowControl w:val="0"/>
+              <w:pBdr>
+                <w:top w:space="0" w:sz="0" w:val="nil"/>
+                <w:left w:space="0" w:sz="0" w:val="nil"/>
+                <w:bottom w:space="0" w:sz="0" w:val="nil"/>
+                <w:right w:space="0" w:sz="0" w:val="nil"/>
+                <w:between w:space="0" w:sz="0" w:val="nil"/>
+              </w:pBdr>
+              <w:shd w:fill="auto" w:val="clear"/>
+              <w:spacing w:after="0" w:before="0" w:line="276" w:lineRule="auto"/>
+              <w:ind w:left="0" w:right="0" w:firstLine="0"/>
+              <w:jc w:val="left"/>
+              <w:rPr>
+                <w:rFonts w:ascii="Times New Roman" w:cs="Times New Roman" w:eastAsia="Times New Roman" w:hAnsi="Times New Roman"/>
+                <w:i w:val="0"/>
+                <w:iCs w:val="0"/>
+                <w:sz w:val="20"/>
+                <w:szCs w:val="20"/>
+              </w:rPr>
+            </w:pPr>
+            <w:r>
+              <w:rPr>
+                <w:rFonts w:ascii="Times New Roman" w:cs="Times New Roman" w:eastAsia="Times New Roman" w:hAnsi="Times New Roman"/>
+                <w:sz w:val="20"/>
+                <w:szCs w:val="20"/>
+              </w:rPr>
+              <w:drawing>
+                <wp:inline distB="114300" distT="114300" distL="114300" distR="114300">
+                  <wp:extent cx="5715000" cy="2231199"/>
+                  <wp:effectExtent b="0" l="0" r="0" t="0"/>
+                  <wp:docPr id="4" name="image7.png"/>
+                  <a:graphic>
+                    <a:graphicData uri="http://schemas.openxmlformats.org/drawingml/2006/picture">
+                      <pic:pic>
+                        <pic:nvPicPr>
+                          <pic:cNvPr id="0" name="image7.png"/>
                           <pic:cNvPicPr preferRelativeResize="0"/>
                         </pic:nvPicPr>
                         <pic:blipFill>
@@ -16039,8 +16968,8 @@
           <w:szCs w:val="28"/>
         </w:rPr>
       </w:pPr>
-      <w:bookmarkStart w:colFirst="0" w:colLast="0" w:name="_no0a5aywzn7j" w:id="31"/>
-      <w:bookmarkEnd w:id="31"/>
+      <w:bookmarkStart w:colFirst="0" w:colLast="0" w:name="_no0a5aywzn7j" w:id="32"/>
+      <w:bookmarkEnd w:id="32"/>
       <w:r>
         <w:rPr>
           <w:rFonts w:ascii="Times New Roman" w:cs="Times New Roman" w:eastAsia="Times New Roman" w:hAnsi="Times New Roman"/>
@@ -16223,8 +17152,8 @@
           <w:szCs w:val="28"/>
         </w:rPr>
       </w:pPr>
-      <w:bookmarkStart w:colFirst="0" w:colLast="0" w:name="_sy72j6hua56u" w:id="32"/>
-      <w:bookmarkEnd w:id="32"/>
+      <w:bookmarkStart w:colFirst="0" w:colLast="0" w:name="_sy72j6hua56u" w:id="33"/>
+      <w:bookmarkEnd w:id="33"/>
       <w:r>
         <w:rPr>
           <w:rFonts w:ascii="Times New Roman" w:cs="Times New Roman" w:eastAsia="Times New Roman" w:hAnsi="Times New Roman"/>
@@ -16407,8 +17336,8 @@
           <w:szCs w:val="28"/>
         </w:rPr>
       </w:pPr>
-      <w:bookmarkStart w:colFirst="0" w:colLast="0" w:name="_itix9b9pp3ez" w:id="33"/>
-      <w:bookmarkEnd w:id="33"/>
+      <w:bookmarkStart w:colFirst="0" w:colLast="0" w:name="_itix9b9pp3ez" w:id="34"/>
+      <w:bookmarkEnd w:id="34"/>
       <w:r>
         <w:rPr>
           <w:rFonts w:ascii="Times New Roman" w:cs="Times New Roman" w:eastAsia="Times New Roman" w:hAnsi="Times New Roman"/>
@@ -16617,8 +17546,8 @@
           <w:szCs w:val="28"/>
         </w:rPr>
       </w:pPr>
-      <w:bookmarkStart w:colFirst="0" w:colLast="0" w:name="_y8puykjqsfef" w:id="34"/>
-      <w:bookmarkEnd w:id="34"/>
+      <w:bookmarkStart w:colFirst="0" w:colLast="0" w:name="_y8puykjqsfef" w:id="35"/>
+      <w:bookmarkEnd w:id="35"/>
       <w:r>
         <w:rPr>
           <w:rFonts w:ascii="Times New Roman" w:cs="Times New Roman" w:eastAsia="Times New Roman" w:hAnsi="Times New Roman"/>
@@ -17025,6 +17954,13 @@
     </w:tblPr>
   </w:style>
   <w:style w:type="table" w:styleId="Table14">
+    <w:basedOn w:val="TableNormal"/>
+    <w:tblPr>
+      <w:tblStyleRowBandSize w:val="1"/>
+      <w:tblStyleColBandSize w:val="1"/>
+    </w:tblPr>
+  </w:style>
+  <w:style w:type="table" w:styleId="Table15">
     <w:basedOn w:val="TableNormal"/>
     <w:tblPr>
       <w:tblStyleRowBandSize w:val="1"/>

</xml_diff>